<commit_message>
Front ennd bug fixing
</commit_message>
<xml_diff>
--- a/Chapter 1-3.docx
+++ b/Chapter 1-3.docx
@@ -1509,7 +1509,7 @@
                 <w:sz w:val="24"/>
                 <w:szCs w:val="24"/>
               </w:rPr>
-              <w:t>11</w:t>
+              <w:t>12</w:t>
             </w:r>
             <w:r>
               <w:rPr>
@@ -1606,7 +1606,7 @@
                 <w:sz w:val="24"/>
                 <w:szCs w:val="24"/>
               </w:rPr>
-              <w:t>11</w:t>
+              <w:t>12</w:t>
             </w:r>
             <w:r>
               <w:rPr>
@@ -1703,7 +1703,7 @@
                 <w:sz w:val="24"/>
                 <w:szCs w:val="24"/>
               </w:rPr>
-              <w:t>11</w:t>
+              <w:t>13</w:t>
             </w:r>
             <w:r>
               <w:rPr>
@@ -1800,7 +1800,7 @@
                 <w:sz w:val="24"/>
                 <w:szCs w:val="24"/>
               </w:rPr>
-              <w:t>12</w:t>
+              <w:t>13</w:t>
             </w:r>
             <w:r>
               <w:rPr>
@@ -1897,7 +1897,7 @@
                 <w:sz w:val="24"/>
                 <w:szCs w:val="24"/>
               </w:rPr>
-              <w:t>13</w:t>
+              <w:t>15</w:t>
             </w:r>
             <w:r>
               <w:rPr>
@@ -1994,7 +1994,7 @@
                 <w:sz w:val="24"/>
                 <w:szCs w:val="24"/>
               </w:rPr>
-              <w:t>13</w:t>
+              <w:t>15</w:t>
             </w:r>
             <w:r>
               <w:rPr>
@@ -2091,7 +2091,7 @@
                 <w:sz w:val="24"/>
                 <w:szCs w:val="24"/>
               </w:rPr>
-              <w:t>14</w:t>
+              <w:t>15</w:t>
             </w:r>
             <w:r>
               <w:rPr>
@@ -2188,7 +2188,7 @@
                 <w:sz w:val="24"/>
                 <w:szCs w:val="24"/>
               </w:rPr>
-              <w:t>14</w:t>
+              <w:t>15</w:t>
             </w:r>
             <w:r>
               <w:rPr>
@@ -2285,7 +2285,7 @@
                 <w:sz w:val="24"/>
                 <w:szCs w:val="24"/>
               </w:rPr>
-              <w:t>14</w:t>
+              <w:t>16</w:t>
             </w:r>
             <w:r>
               <w:rPr>
@@ -2382,7 +2382,7 @@
                 <w:sz w:val="24"/>
                 <w:szCs w:val="24"/>
               </w:rPr>
-              <w:t>15</w:t>
+              <w:t>16</w:t>
             </w:r>
             <w:r>
               <w:rPr>
@@ -2479,7 +2479,7 @@
                 <w:sz w:val="24"/>
                 <w:szCs w:val="24"/>
               </w:rPr>
-              <w:t>15</w:t>
+              <w:t>16</w:t>
             </w:r>
             <w:r>
               <w:rPr>
@@ -2576,7 +2576,7 @@
                 <w:sz w:val="24"/>
                 <w:szCs w:val="24"/>
               </w:rPr>
-              <w:t>15</w:t>
+              <w:t>16</w:t>
             </w:r>
             <w:r>
               <w:rPr>
@@ -2673,7 +2673,7 @@
                 <w:sz w:val="24"/>
                 <w:szCs w:val="24"/>
               </w:rPr>
-              <w:t>15</w:t>
+              <w:t>17</w:t>
             </w:r>
             <w:r>
               <w:rPr>
@@ -2770,7 +2770,7 @@
                 <w:sz w:val="24"/>
                 <w:szCs w:val="24"/>
               </w:rPr>
-              <w:t>15</w:t>
+              <w:t>17</w:t>
             </w:r>
             <w:r>
               <w:rPr>
@@ -2867,7 +2867,7 @@
                 <w:sz w:val="24"/>
                 <w:szCs w:val="24"/>
               </w:rPr>
-              <w:t>16</w:t>
+              <w:t>17</w:t>
             </w:r>
             <w:r>
               <w:rPr>
@@ -2964,7 +2964,7 @@
                 <w:sz w:val="24"/>
                 <w:szCs w:val="24"/>
               </w:rPr>
-              <w:t>16</w:t>
+              <w:t>18</w:t>
             </w:r>
             <w:r>
               <w:rPr>
@@ -3061,7 +3061,7 @@
                 <w:sz w:val="24"/>
                 <w:szCs w:val="24"/>
               </w:rPr>
-              <w:t>16</w:t>
+              <w:t>18</w:t>
             </w:r>
             <w:r>
               <w:rPr>
@@ -3158,7 +3158,7 @@
                 <w:sz w:val="24"/>
                 <w:szCs w:val="24"/>
               </w:rPr>
-              <w:t>17</w:t>
+              <w:t>18</w:t>
             </w:r>
             <w:r>
               <w:rPr>
@@ -3255,7 +3255,7 @@
                 <w:sz w:val="24"/>
                 <w:szCs w:val="24"/>
               </w:rPr>
-              <w:t>17</w:t>
+              <w:t>19</w:t>
             </w:r>
             <w:r>
               <w:rPr>
@@ -3352,7 +3352,7 @@
                 <w:sz w:val="24"/>
                 <w:szCs w:val="24"/>
               </w:rPr>
-              <w:t>17</w:t>
+              <w:t>19</w:t>
             </w:r>
             <w:r>
               <w:rPr>
@@ -3449,7 +3449,7 @@
                 <w:sz w:val="24"/>
                 <w:szCs w:val="24"/>
               </w:rPr>
-              <w:t>18</w:t>
+              <w:t>19</w:t>
             </w:r>
             <w:r>
               <w:rPr>
@@ -3546,7 +3546,7 @@
                 <w:sz w:val="24"/>
                 <w:szCs w:val="24"/>
               </w:rPr>
-              <w:t>18</w:t>
+              <w:t>19</w:t>
             </w:r>
             <w:r>
               <w:rPr>
@@ -3643,7 +3643,7 @@
                 <w:sz w:val="24"/>
                 <w:szCs w:val="24"/>
               </w:rPr>
-              <w:t>18</w:t>
+              <w:t>20</w:t>
             </w:r>
             <w:r>
               <w:rPr>
@@ -3740,7 +3740,7 @@
                 <w:sz w:val="24"/>
                 <w:szCs w:val="24"/>
               </w:rPr>
-              <w:t>18</w:t>
+              <w:t>20</w:t>
             </w:r>
             <w:r>
               <w:rPr>
@@ -3837,7 +3837,7 @@
                 <w:sz w:val="24"/>
                 <w:szCs w:val="24"/>
               </w:rPr>
-              <w:t>19</w:t>
+              <w:t>20</w:t>
             </w:r>
             <w:r>
               <w:rPr>
@@ -3934,7 +3934,7 @@
                 <w:sz w:val="24"/>
                 <w:szCs w:val="24"/>
               </w:rPr>
-              <w:t>19</w:t>
+              <w:t>20</w:t>
             </w:r>
             <w:r>
               <w:rPr>
@@ -4031,7 +4031,7 @@
                 <w:sz w:val="24"/>
                 <w:szCs w:val="24"/>
               </w:rPr>
-              <w:t>19</w:t>
+              <w:t>20</w:t>
             </w:r>
             <w:r>
               <w:rPr>
@@ -4128,7 +4128,7 @@
                 <w:sz w:val="24"/>
                 <w:szCs w:val="24"/>
               </w:rPr>
-              <w:t>19</w:t>
+              <w:t>21</w:t>
             </w:r>
             <w:r>
               <w:rPr>
@@ -5382,7 +5382,25 @@
           <w:sz w:val="24"/>
           <w:szCs w:val="24"/>
         </w:rPr>
-        <w:t xml:space="preserve"> The real-time nature of GuriGate required a stable internet connection. Fluctuations in local internet speeds sometimes affected the performance of high-resolution image rendering and real-time synchronization during testing.</w:t>
+        <w:t xml:space="preserve"> The real-time nature of GuriGate </w:t>
+      </w:r>
+      <w:proofErr w:type="gramStart"/>
+      <w:r>
+        <w:rPr>
+          <w:rFonts w:asciiTheme="majorBidi" w:hAnsiTheme="majorBidi" w:cstheme="majorBidi"/>
+          <w:sz w:val="24"/>
+          <w:szCs w:val="24"/>
+        </w:rPr>
+        <w:t>required</w:t>
+      </w:r>
+      <w:proofErr w:type="gramEnd"/>
+      <w:r>
+        <w:rPr>
+          <w:rFonts w:asciiTheme="majorBidi" w:hAnsiTheme="majorBidi" w:cstheme="majorBidi"/>
+          <w:sz w:val="24"/>
+          <w:szCs w:val="24"/>
+        </w:rPr>
+        <w:t xml:space="preserve"> a stable internet connection. Fluctuations in local internet speeds sometimes affected the performance of high-resolution image rendering and real-time synchronization during testing.</w:t>
       </w:r>
     </w:p>
     <w:p>
@@ -5479,12 +5497,1245 @@
       <w:pPr>
         <w:bidi w:val="0"/>
         <w:spacing w:line="360" w:lineRule="auto"/>
-        <w:rPr>
-          <w:rFonts w:asciiTheme="majorBidi" w:hAnsiTheme="majorBidi" w:cstheme="majorBidi"/>
-          <w:sz w:val="24"/>
-          <w:szCs w:val="24"/>
-        </w:rPr>
-      </w:pPr>
+        <w:jc w:val="both"/>
+        <w:rPr>
+          <w:rFonts w:asciiTheme="majorBidi" w:hAnsiTheme="majorBidi" w:cstheme="majorBidi"/>
+          <w:sz w:val="24"/>
+          <w:szCs w:val="24"/>
+        </w:rPr>
+      </w:pPr>
+    </w:p>
+    <w:p>
+      <w:pPr>
+        <w:bidi w:val="0"/>
+        <w:spacing w:line="360" w:lineRule="auto"/>
+        <w:jc w:val="both"/>
+        <w:rPr>
+          <w:rFonts w:asciiTheme="majorBidi" w:hAnsiTheme="majorBidi" w:cstheme="majorBidi"/>
+          <w:sz w:val="24"/>
+          <w:szCs w:val="24"/>
+        </w:rPr>
+      </w:pPr>
+    </w:p>
+    <w:p>
+      <w:pPr>
+        <w:pStyle w:val="Heading2"/>
+        <w:bidi w:val="0"/>
+        <w:rPr>
+          <w:b/>
+          <w:bCs/>
+        </w:rPr>
+      </w:pPr>
+      <w:r>
+        <w:rPr>
+          <w:b/>
+          <w:bCs/>
+        </w:rPr>
+        <w:lastRenderedPageBreak/>
+        <w:t xml:space="preserve">1.9 </w:t>
+      </w:r>
+      <w:r>
+        <w:rPr>
+          <w:b/>
+          <w:bCs/>
+        </w:rPr>
+        <w:t>ABBREVIATIONS AND ACRONYMS</w:t>
+      </w:r>
+    </w:p>
+    <w:p>
+      <w:pPr>
+        <w:pStyle w:val="ListParagraph"/>
+        <w:numPr>
+          <w:ilvl w:val="0"/>
+          <w:numId w:val="16"/>
+        </w:numPr>
+        <w:bidi w:val="0"/>
+        <w:spacing w:line="360" w:lineRule="auto"/>
+        <w:jc w:val="both"/>
+        <w:rPr>
+          <w:rFonts w:asciiTheme="majorBidi" w:hAnsiTheme="majorBidi" w:cstheme="majorBidi"/>
+          <w:sz w:val="24"/>
+          <w:szCs w:val="24"/>
+        </w:rPr>
+      </w:pPr>
+      <w:r>
+        <w:rPr>
+          <w:rFonts w:asciiTheme="majorBidi" w:hAnsiTheme="majorBidi" w:cstheme="majorBidi"/>
+          <w:sz w:val="24"/>
+          <w:szCs w:val="24"/>
+        </w:rPr>
+        <w:t>AI – Artificial Intelligence</w:t>
+      </w:r>
+    </w:p>
+    <w:p>
+      <w:pPr>
+        <w:pStyle w:val="ListParagraph"/>
+        <w:numPr>
+          <w:ilvl w:val="0"/>
+          <w:numId w:val="16"/>
+        </w:numPr>
+        <w:bidi w:val="0"/>
+        <w:spacing w:line="360" w:lineRule="auto"/>
+        <w:jc w:val="both"/>
+        <w:rPr>
+          <w:rFonts w:asciiTheme="majorBidi" w:hAnsiTheme="majorBidi" w:cstheme="majorBidi"/>
+          <w:sz w:val="24"/>
+          <w:szCs w:val="24"/>
+        </w:rPr>
+      </w:pPr>
+      <w:r>
+        <w:rPr>
+          <w:rFonts w:asciiTheme="majorBidi" w:hAnsiTheme="majorBidi" w:cstheme="majorBidi"/>
+          <w:sz w:val="24"/>
+          <w:szCs w:val="24"/>
+        </w:rPr>
+        <w:t>API – Application Programming Interface</w:t>
+      </w:r>
+    </w:p>
+    <w:p>
+      <w:pPr>
+        <w:pStyle w:val="ListParagraph"/>
+        <w:numPr>
+          <w:ilvl w:val="0"/>
+          <w:numId w:val="16"/>
+        </w:numPr>
+        <w:bidi w:val="0"/>
+        <w:spacing w:line="360" w:lineRule="auto"/>
+        <w:jc w:val="both"/>
+        <w:rPr>
+          <w:rFonts w:asciiTheme="majorBidi" w:hAnsiTheme="majorBidi" w:cstheme="majorBidi"/>
+          <w:sz w:val="24"/>
+          <w:szCs w:val="24"/>
+        </w:rPr>
+      </w:pPr>
+      <w:r>
+        <w:rPr>
+          <w:rFonts w:asciiTheme="majorBidi" w:hAnsiTheme="majorBidi" w:cstheme="majorBidi"/>
+          <w:sz w:val="24"/>
+          <w:szCs w:val="24"/>
+        </w:rPr>
+        <w:t>CRUD – Create, Read, Update, Delete</w:t>
+      </w:r>
+    </w:p>
+    <w:p>
+      <w:pPr>
+        <w:pStyle w:val="ListParagraph"/>
+        <w:numPr>
+          <w:ilvl w:val="0"/>
+          <w:numId w:val="16"/>
+        </w:numPr>
+        <w:bidi w:val="0"/>
+        <w:spacing w:line="360" w:lineRule="auto"/>
+        <w:jc w:val="both"/>
+        <w:rPr>
+          <w:rFonts w:asciiTheme="majorBidi" w:hAnsiTheme="majorBidi" w:cstheme="majorBidi"/>
+          <w:sz w:val="24"/>
+          <w:szCs w:val="24"/>
+        </w:rPr>
+      </w:pPr>
+      <w:r>
+        <w:rPr>
+          <w:rFonts w:asciiTheme="majorBidi" w:hAnsiTheme="majorBidi" w:cstheme="majorBidi"/>
+          <w:sz w:val="24"/>
+          <w:szCs w:val="24"/>
+        </w:rPr>
+        <w:t>CSS – Cascading Style Sheets</w:t>
+      </w:r>
+    </w:p>
+    <w:p>
+      <w:pPr>
+        <w:pStyle w:val="ListParagraph"/>
+        <w:numPr>
+          <w:ilvl w:val="0"/>
+          <w:numId w:val="16"/>
+        </w:numPr>
+        <w:bidi w:val="0"/>
+        <w:spacing w:line="360" w:lineRule="auto"/>
+        <w:jc w:val="both"/>
+        <w:rPr>
+          <w:rFonts w:asciiTheme="majorBidi" w:hAnsiTheme="majorBidi" w:cstheme="majorBidi"/>
+          <w:sz w:val="24"/>
+          <w:szCs w:val="24"/>
+        </w:rPr>
+      </w:pPr>
+      <w:r>
+        <w:rPr>
+          <w:rFonts w:asciiTheme="majorBidi" w:hAnsiTheme="majorBidi" w:cstheme="majorBidi"/>
+          <w:sz w:val="24"/>
+          <w:szCs w:val="24"/>
+        </w:rPr>
+        <w:t>DFD – Data Flow Diagram</w:t>
+      </w:r>
+    </w:p>
+    <w:p>
+      <w:pPr>
+        <w:pStyle w:val="ListParagraph"/>
+        <w:numPr>
+          <w:ilvl w:val="0"/>
+          <w:numId w:val="16"/>
+        </w:numPr>
+        <w:bidi w:val="0"/>
+        <w:spacing w:line="360" w:lineRule="auto"/>
+        <w:jc w:val="both"/>
+        <w:rPr>
+          <w:rFonts w:asciiTheme="majorBidi" w:hAnsiTheme="majorBidi" w:cstheme="majorBidi"/>
+          <w:sz w:val="24"/>
+          <w:szCs w:val="24"/>
+        </w:rPr>
+      </w:pPr>
+      <w:r>
+        <w:rPr>
+          <w:rFonts w:asciiTheme="majorBidi" w:hAnsiTheme="majorBidi" w:cstheme="majorBidi"/>
+          <w:sz w:val="24"/>
+          <w:szCs w:val="24"/>
+        </w:rPr>
+        <w:t>DOI – Diffusion of Innovation Theory</w:t>
+      </w:r>
+    </w:p>
+    <w:p>
+      <w:pPr>
+        <w:pStyle w:val="ListParagraph"/>
+        <w:numPr>
+          <w:ilvl w:val="0"/>
+          <w:numId w:val="16"/>
+        </w:numPr>
+        <w:bidi w:val="0"/>
+        <w:spacing w:line="360" w:lineRule="auto"/>
+        <w:jc w:val="both"/>
+        <w:rPr>
+          <w:rFonts w:asciiTheme="majorBidi" w:hAnsiTheme="majorBidi" w:cstheme="majorBidi"/>
+          <w:sz w:val="24"/>
+          <w:szCs w:val="24"/>
+        </w:rPr>
+      </w:pPr>
+      <w:r>
+        <w:rPr>
+          <w:rFonts w:asciiTheme="majorBidi" w:hAnsiTheme="majorBidi" w:cstheme="majorBidi"/>
+          <w:sz w:val="24"/>
+          <w:szCs w:val="24"/>
+        </w:rPr>
+        <w:t>ERD – Entity Relationship Diagram</w:t>
+      </w:r>
+    </w:p>
+    <w:p>
+      <w:pPr>
+        <w:pStyle w:val="ListParagraph"/>
+        <w:numPr>
+          <w:ilvl w:val="0"/>
+          <w:numId w:val="16"/>
+        </w:numPr>
+        <w:bidi w:val="0"/>
+        <w:spacing w:line="360" w:lineRule="auto"/>
+        <w:jc w:val="both"/>
+        <w:rPr>
+          <w:rFonts w:asciiTheme="majorBidi" w:hAnsiTheme="majorBidi" w:cstheme="majorBidi"/>
+          <w:sz w:val="24"/>
+          <w:szCs w:val="24"/>
+        </w:rPr>
+      </w:pPr>
+      <w:r>
+        <w:rPr>
+          <w:rFonts w:asciiTheme="majorBidi" w:hAnsiTheme="majorBidi" w:cstheme="majorBidi"/>
+          <w:sz w:val="24"/>
+          <w:szCs w:val="24"/>
+        </w:rPr>
+        <w:t xml:space="preserve">HTML – </w:t>
+      </w:r>
+      <w:proofErr w:type="spellStart"/>
+      <w:r>
+        <w:rPr>
+          <w:rFonts w:asciiTheme="majorBidi" w:hAnsiTheme="majorBidi" w:cstheme="majorBidi"/>
+          <w:sz w:val="24"/>
+          <w:szCs w:val="24"/>
+        </w:rPr>
+        <w:t>HyperText</w:t>
+      </w:r>
+      <w:proofErr w:type="spellEnd"/>
+      <w:r>
+        <w:rPr>
+          <w:rFonts w:asciiTheme="majorBidi" w:hAnsiTheme="majorBidi" w:cstheme="majorBidi"/>
+          <w:sz w:val="24"/>
+          <w:szCs w:val="24"/>
+        </w:rPr>
+        <w:t xml:space="preserve"> Markup Language</w:t>
+      </w:r>
+    </w:p>
+    <w:p>
+      <w:pPr>
+        <w:pStyle w:val="ListParagraph"/>
+        <w:numPr>
+          <w:ilvl w:val="0"/>
+          <w:numId w:val="16"/>
+        </w:numPr>
+        <w:bidi w:val="0"/>
+        <w:spacing w:line="360" w:lineRule="auto"/>
+        <w:jc w:val="both"/>
+        <w:rPr>
+          <w:rFonts w:asciiTheme="majorBidi" w:hAnsiTheme="majorBidi" w:cstheme="majorBidi"/>
+          <w:sz w:val="24"/>
+          <w:szCs w:val="24"/>
+        </w:rPr>
+      </w:pPr>
+      <w:r>
+        <w:rPr>
+          <w:rFonts w:asciiTheme="majorBidi" w:hAnsiTheme="majorBidi" w:cstheme="majorBidi"/>
+          <w:sz w:val="24"/>
+          <w:szCs w:val="24"/>
+        </w:rPr>
+        <w:t>ICT – Information and Communication Technology</w:t>
+      </w:r>
+    </w:p>
+    <w:p>
+      <w:pPr>
+        <w:pStyle w:val="ListParagraph"/>
+        <w:numPr>
+          <w:ilvl w:val="0"/>
+          <w:numId w:val="16"/>
+        </w:numPr>
+        <w:bidi w:val="0"/>
+        <w:spacing w:line="360" w:lineRule="auto"/>
+        <w:jc w:val="both"/>
+        <w:rPr>
+          <w:rFonts w:asciiTheme="majorBidi" w:hAnsiTheme="majorBidi" w:cstheme="majorBidi"/>
+          <w:sz w:val="24"/>
+          <w:szCs w:val="24"/>
+        </w:rPr>
+      </w:pPr>
+      <w:r>
+        <w:rPr>
+          <w:rFonts w:asciiTheme="majorBidi" w:hAnsiTheme="majorBidi" w:cstheme="majorBidi"/>
+          <w:sz w:val="24"/>
+          <w:szCs w:val="24"/>
+        </w:rPr>
+        <w:t>JSON – JavaScript Object Notation</w:t>
+      </w:r>
+    </w:p>
+    <w:p>
+      <w:pPr>
+        <w:pStyle w:val="ListParagraph"/>
+        <w:numPr>
+          <w:ilvl w:val="0"/>
+          <w:numId w:val="16"/>
+        </w:numPr>
+        <w:bidi w:val="0"/>
+        <w:spacing w:line="360" w:lineRule="auto"/>
+        <w:jc w:val="both"/>
+        <w:rPr>
+          <w:rFonts w:asciiTheme="majorBidi" w:hAnsiTheme="majorBidi" w:cstheme="majorBidi"/>
+          <w:sz w:val="24"/>
+          <w:szCs w:val="24"/>
+        </w:rPr>
+      </w:pPr>
+      <w:r>
+        <w:rPr>
+          <w:rFonts w:asciiTheme="majorBidi" w:hAnsiTheme="majorBidi" w:cstheme="majorBidi"/>
+          <w:sz w:val="24"/>
+          <w:szCs w:val="24"/>
+        </w:rPr>
+        <w:t>KPI – Key Performance Indicator</w:t>
+      </w:r>
+    </w:p>
+    <w:p>
+      <w:pPr>
+        <w:pStyle w:val="ListParagraph"/>
+        <w:numPr>
+          <w:ilvl w:val="0"/>
+          <w:numId w:val="16"/>
+        </w:numPr>
+        <w:bidi w:val="0"/>
+        <w:spacing w:line="360" w:lineRule="auto"/>
+        <w:jc w:val="both"/>
+        <w:rPr>
+          <w:rFonts w:asciiTheme="majorBidi" w:hAnsiTheme="majorBidi" w:cstheme="majorBidi"/>
+          <w:sz w:val="24"/>
+          <w:szCs w:val="24"/>
+        </w:rPr>
+      </w:pPr>
+      <w:r>
+        <w:rPr>
+          <w:rFonts w:asciiTheme="majorBidi" w:hAnsiTheme="majorBidi" w:cstheme="majorBidi"/>
+          <w:sz w:val="24"/>
+          <w:szCs w:val="24"/>
+        </w:rPr>
+        <w:t>MVC – Model View Controller</w:t>
+      </w:r>
+    </w:p>
+    <w:p>
+      <w:pPr>
+        <w:pStyle w:val="ListParagraph"/>
+        <w:numPr>
+          <w:ilvl w:val="0"/>
+          <w:numId w:val="16"/>
+        </w:numPr>
+        <w:bidi w:val="0"/>
+        <w:spacing w:line="360" w:lineRule="auto"/>
+        <w:jc w:val="both"/>
+        <w:rPr>
+          <w:rFonts w:asciiTheme="majorBidi" w:hAnsiTheme="majorBidi" w:cstheme="majorBidi"/>
+          <w:sz w:val="24"/>
+          <w:szCs w:val="24"/>
+        </w:rPr>
+      </w:pPr>
+      <w:r>
+        <w:rPr>
+          <w:rFonts w:asciiTheme="majorBidi" w:hAnsiTheme="majorBidi" w:cstheme="majorBidi"/>
+          <w:sz w:val="24"/>
+          <w:szCs w:val="24"/>
+        </w:rPr>
+        <w:t>NIN – National Identification Number</w:t>
+      </w:r>
+    </w:p>
+    <w:p>
+      <w:pPr>
+        <w:pStyle w:val="ListParagraph"/>
+        <w:numPr>
+          <w:ilvl w:val="0"/>
+          <w:numId w:val="16"/>
+        </w:numPr>
+        <w:bidi w:val="0"/>
+        <w:spacing w:line="360" w:lineRule="auto"/>
+        <w:jc w:val="both"/>
+        <w:rPr>
+          <w:rFonts w:asciiTheme="majorBidi" w:hAnsiTheme="majorBidi" w:cstheme="majorBidi"/>
+          <w:sz w:val="24"/>
+          <w:szCs w:val="24"/>
+        </w:rPr>
+      </w:pPr>
+      <w:r>
+        <w:rPr>
+          <w:rFonts w:asciiTheme="majorBidi" w:hAnsiTheme="majorBidi" w:cstheme="majorBidi"/>
+          <w:sz w:val="24"/>
+          <w:szCs w:val="24"/>
+        </w:rPr>
+        <w:t>PRD – Product Requirements Document</w:t>
+      </w:r>
+    </w:p>
+    <w:p>
+      <w:pPr>
+        <w:pStyle w:val="ListParagraph"/>
+        <w:numPr>
+          <w:ilvl w:val="0"/>
+          <w:numId w:val="16"/>
+        </w:numPr>
+        <w:bidi w:val="0"/>
+        <w:spacing w:line="360" w:lineRule="auto"/>
+        <w:jc w:val="both"/>
+        <w:rPr>
+          <w:rFonts w:asciiTheme="majorBidi" w:hAnsiTheme="majorBidi" w:cstheme="majorBidi"/>
+          <w:sz w:val="24"/>
+          <w:szCs w:val="24"/>
+        </w:rPr>
+      </w:pPr>
+      <w:proofErr w:type="spellStart"/>
+      <w:r>
+        <w:rPr>
+          <w:rFonts w:asciiTheme="majorBidi" w:hAnsiTheme="majorBidi" w:cstheme="majorBidi"/>
+          <w:sz w:val="24"/>
+          <w:szCs w:val="24"/>
+        </w:rPr>
+        <w:t>PropTech</w:t>
+      </w:r>
+      <w:proofErr w:type="spellEnd"/>
+      <w:r>
+        <w:rPr>
+          <w:rFonts w:asciiTheme="majorBidi" w:hAnsiTheme="majorBidi" w:cstheme="majorBidi"/>
+          <w:sz w:val="24"/>
+          <w:szCs w:val="24"/>
+        </w:rPr>
+        <w:t xml:space="preserve"> – Property Technology</w:t>
+      </w:r>
+    </w:p>
+    <w:p>
+      <w:pPr>
+        <w:pStyle w:val="ListParagraph"/>
+        <w:numPr>
+          <w:ilvl w:val="0"/>
+          <w:numId w:val="16"/>
+        </w:numPr>
+        <w:bidi w:val="0"/>
+        <w:spacing w:line="360" w:lineRule="auto"/>
+        <w:jc w:val="both"/>
+        <w:rPr>
+          <w:rFonts w:asciiTheme="majorBidi" w:hAnsiTheme="majorBidi" w:cstheme="majorBidi"/>
+          <w:sz w:val="24"/>
+          <w:szCs w:val="24"/>
+        </w:rPr>
+      </w:pPr>
+      <w:r>
+        <w:rPr>
+          <w:rFonts w:asciiTheme="majorBidi" w:hAnsiTheme="majorBidi" w:cstheme="majorBidi"/>
+          <w:sz w:val="24"/>
+          <w:szCs w:val="24"/>
+        </w:rPr>
+        <w:t>RBAC – Role-Based Access Control</w:t>
+      </w:r>
+    </w:p>
+    <w:p>
+      <w:pPr>
+        <w:pStyle w:val="ListParagraph"/>
+        <w:numPr>
+          <w:ilvl w:val="0"/>
+          <w:numId w:val="16"/>
+        </w:numPr>
+        <w:bidi w:val="0"/>
+        <w:spacing w:line="360" w:lineRule="auto"/>
+        <w:jc w:val="both"/>
+        <w:rPr>
+          <w:rFonts w:asciiTheme="majorBidi" w:hAnsiTheme="majorBidi" w:cstheme="majorBidi"/>
+          <w:sz w:val="24"/>
+          <w:szCs w:val="24"/>
+        </w:rPr>
+      </w:pPr>
+      <w:r>
+        <w:rPr>
+          <w:rFonts w:asciiTheme="majorBidi" w:hAnsiTheme="majorBidi" w:cstheme="majorBidi"/>
+          <w:sz w:val="24"/>
+          <w:szCs w:val="24"/>
+        </w:rPr>
+        <w:t>ReactJS – React JavaScript Library</w:t>
+      </w:r>
+    </w:p>
+    <w:p>
+      <w:pPr>
+        <w:pStyle w:val="ListParagraph"/>
+        <w:numPr>
+          <w:ilvl w:val="0"/>
+          <w:numId w:val="16"/>
+        </w:numPr>
+        <w:bidi w:val="0"/>
+        <w:spacing w:line="360" w:lineRule="auto"/>
+        <w:jc w:val="both"/>
+        <w:rPr>
+          <w:rFonts w:asciiTheme="majorBidi" w:hAnsiTheme="majorBidi" w:cstheme="majorBidi"/>
+          <w:sz w:val="24"/>
+          <w:szCs w:val="24"/>
+        </w:rPr>
+      </w:pPr>
+      <w:r>
+        <w:rPr>
+          <w:rFonts w:asciiTheme="majorBidi" w:hAnsiTheme="majorBidi" w:cstheme="majorBidi"/>
+          <w:sz w:val="24"/>
+          <w:szCs w:val="24"/>
+        </w:rPr>
+        <w:t>RLS – Row Level Security</w:t>
+      </w:r>
+    </w:p>
+    <w:p>
+      <w:pPr>
+        <w:pStyle w:val="ListParagraph"/>
+        <w:numPr>
+          <w:ilvl w:val="0"/>
+          <w:numId w:val="16"/>
+        </w:numPr>
+        <w:bidi w:val="0"/>
+        <w:spacing w:line="360" w:lineRule="auto"/>
+        <w:jc w:val="both"/>
+        <w:rPr>
+          <w:rFonts w:asciiTheme="majorBidi" w:hAnsiTheme="majorBidi" w:cstheme="majorBidi"/>
+          <w:sz w:val="24"/>
+          <w:szCs w:val="24"/>
+        </w:rPr>
+      </w:pPr>
+      <w:r>
+        <w:rPr>
+          <w:rFonts w:asciiTheme="majorBidi" w:hAnsiTheme="majorBidi" w:cstheme="majorBidi"/>
+          <w:sz w:val="24"/>
+          <w:szCs w:val="24"/>
+        </w:rPr>
+        <w:t>RMS – Residential Management System</w:t>
+      </w:r>
+    </w:p>
+    <w:p>
+      <w:pPr>
+        <w:pStyle w:val="ListParagraph"/>
+        <w:numPr>
+          <w:ilvl w:val="0"/>
+          <w:numId w:val="16"/>
+        </w:numPr>
+        <w:bidi w:val="0"/>
+        <w:spacing w:line="360" w:lineRule="auto"/>
+        <w:jc w:val="both"/>
+        <w:rPr>
+          <w:rFonts w:asciiTheme="majorBidi" w:hAnsiTheme="majorBidi" w:cstheme="majorBidi"/>
+          <w:sz w:val="24"/>
+          <w:szCs w:val="24"/>
+        </w:rPr>
+      </w:pPr>
+      <w:r>
+        <w:rPr>
+          <w:rFonts w:asciiTheme="majorBidi" w:hAnsiTheme="majorBidi" w:cstheme="majorBidi"/>
+          <w:sz w:val="24"/>
+          <w:szCs w:val="24"/>
+        </w:rPr>
+        <w:t>SaaS – Software as a Service</w:t>
+      </w:r>
+    </w:p>
+    <w:p>
+      <w:pPr>
+        <w:pStyle w:val="ListParagraph"/>
+        <w:numPr>
+          <w:ilvl w:val="0"/>
+          <w:numId w:val="16"/>
+        </w:numPr>
+        <w:bidi w:val="0"/>
+        <w:spacing w:line="360" w:lineRule="auto"/>
+        <w:jc w:val="both"/>
+        <w:rPr>
+          <w:rFonts w:asciiTheme="majorBidi" w:hAnsiTheme="majorBidi" w:cstheme="majorBidi"/>
+          <w:sz w:val="24"/>
+          <w:szCs w:val="24"/>
+        </w:rPr>
+      </w:pPr>
+      <w:r>
+        <w:rPr>
+          <w:rFonts w:asciiTheme="majorBidi" w:hAnsiTheme="majorBidi" w:cstheme="majorBidi"/>
+          <w:sz w:val="24"/>
+          <w:szCs w:val="24"/>
+        </w:rPr>
+        <w:t>SHA-512 – Secure Hash Algorithm 512-bit</w:t>
+      </w:r>
+    </w:p>
+    <w:p>
+      <w:pPr>
+        <w:pStyle w:val="ListParagraph"/>
+        <w:numPr>
+          <w:ilvl w:val="0"/>
+          <w:numId w:val="16"/>
+        </w:numPr>
+        <w:bidi w:val="0"/>
+        <w:spacing w:line="360" w:lineRule="auto"/>
+        <w:jc w:val="both"/>
+        <w:rPr>
+          <w:rFonts w:asciiTheme="majorBidi" w:hAnsiTheme="majorBidi" w:cstheme="majorBidi"/>
+          <w:sz w:val="24"/>
+          <w:szCs w:val="24"/>
+        </w:rPr>
+      </w:pPr>
+      <w:r>
+        <w:rPr>
+          <w:rFonts w:asciiTheme="majorBidi" w:hAnsiTheme="majorBidi" w:cstheme="majorBidi"/>
+          <w:sz w:val="24"/>
+          <w:szCs w:val="24"/>
+        </w:rPr>
+        <w:t>SMS – Short Message Service</w:t>
+      </w:r>
+    </w:p>
+    <w:p>
+      <w:pPr>
+        <w:pStyle w:val="ListParagraph"/>
+        <w:numPr>
+          <w:ilvl w:val="0"/>
+          <w:numId w:val="16"/>
+        </w:numPr>
+        <w:bidi w:val="0"/>
+        <w:spacing w:line="360" w:lineRule="auto"/>
+        <w:jc w:val="both"/>
+        <w:rPr>
+          <w:rFonts w:asciiTheme="majorBidi" w:hAnsiTheme="majorBidi" w:cstheme="majorBidi"/>
+          <w:sz w:val="24"/>
+          <w:szCs w:val="24"/>
+        </w:rPr>
+      </w:pPr>
+      <w:r>
+        <w:rPr>
+          <w:rFonts w:asciiTheme="majorBidi" w:hAnsiTheme="majorBidi" w:cstheme="majorBidi"/>
+          <w:sz w:val="24"/>
+          <w:szCs w:val="24"/>
+        </w:rPr>
+        <w:t>SQL – Structured Query Language</w:t>
+      </w:r>
+    </w:p>
+    <w:p>
+      <w:pPr>
+        <w:pStyle w:val="ListParagraph"/>
+        <w:numPr>
+          <w:ilvl w:val="0"/>
+          <w:numId w:val="16"/>
+        </w:numPr>
+        <w:bidi w:val="0"/>
+        <w:spacing w:line="360" w:lineRule="auto"/>
+        <w:jc w:val="both"/>
+        <w:rPr>
+          <w:rFonts w:asciiTheme="majorBidi" w:hAnsiTheme="majorBidi" w:cstheme="majorBidi"/>
+          <w:sz w:val="24"/>
+          <w:szCs w:val="24"/>
+        </w:rPr>
+      </w:pPr>
+      <w:proofErr w:type="spellStart"/>
+      <w:r>
+        <w:rPr>
+          <w:rFonts w:asciiTheme="majorBidi" w:hAnsiTheme="majorBidi" w:cstheme="majorBidi"/>
+          <w:sz w:val="24"/>
+          <w:szCs w:val="24"/>
+        </w:rPr>
+        <w:t>Supabase</w:t>
+      </w:r>
+      <w:proofErr w:type="spellEnd"/>
+      <w:r>
+        <w:rPr>
+          <w:rFonts w:asciiTheme="majorBidi" w:hAnsiTheme="majorBidi" w:cstheme="majorBidi"/>
+          <w:sz w:val="24"/>
+          <w:szCs w:val="24"/>
+        </w:rPr>
+        <w:t xml:space="preserve"> – </w:t>
+      </w:r>
+      <w:proofErr w:type="gramStart"/>
+      <w:r>
+        <w:rPr>
+          <w:rFonts w:asciiTheme="majorBidi" w:hAnsiTheme="majorBidi" w:cstheme="majorBidi"/>
+          <w:sz w:val="24"/>
+          <w:szCs w:val="24"/>
+        </w:rPr>
+        <w:t>Open Source</w:t>
+      </w:r>
+      <w:proofErr w:type="gramEnd"/>
+      <w:r>
+        <w:rPr>
+          <w:rFonts w:asciiTheme="majorBidi" w:hAnsiTheme="majorBidi" w:cstheme="majorBidi"/>
+          <w:sz w:val="24"/>
+          <w:szCs w:val="24"/>
+        </w:rPr>
+        <w:t xml:space="preserve"> Backend Platform Based on PostgreSQL</w:t>
+      </w:r>
+    </w:p>
+    <w:p>
+      <w:pPr>
+        <w:pStyle w:val="ListParagraph"/>
+        <w:numPr>
+          <w:ilvl w:val="0"/>
+          <w:numId w:val="16"/>
+        </w:numPr>
+        <w:bidi w:val="0"/>
+        <w:spacing w:line="360" w:lineRule="auto"/>
+        <w:jc w:val="both"/>
+        <w:rPr>
+          <w:rFonts w:asciiTheme="majorBidi" w:hAnsiTheme="majorBidi" w:cstheme="majorBidi"/>
+          <w:sz w:val="24"/>
+          <w:szCs w:val="24"/>
+        </w:rPr>
+      </w:pPr>
+      <w:r>
+        <w:rPr>
+          <w:rFonts w:asciiTheme="majorBidi" w:hAnsiTheme="majorBidi" w:cstheme="majorBidi"/>
+          <w:sz w:val="24"/>
+          <w:szCs w:val="24"/>
+        </w:rPr>
+        <w:t>TAM – Technology Acceptance Model</w:t>
+      </w:r>
+    </w:p>
+    <w:p>
+      <w:pPr>
+        <w:pStyle w:val="ListParagraph"/>
+        <w:numPr>
+          <w:ilvl w:val="0"/>
+          <w:numId w:val="16"/>
+        </w:numPr>
+        <w:bidi w:val="0"/>
+        <w:spacing w:line="360" w:lineRule="auto"/>
+        <w:jc w:val="both"/>
+        <w:rPr>
+          <w:rFonts w:asciiTheme="majorBidi" w:hAnsiTheme="majorBidi" w:cstheme="majorBidi"/>
+          <w:sz w:val="24"/>
+          <w:szCs w:val="24"/>
+        </w:rPr>
+      </w:pPr>
+      <w:r>
+        <w:rPr>
+          <w:rFonts w:asciiTheme="majorBidi" w:hAnsiTheme="majorBidi" w:cstheme="majorBidi"/>
+          <w:sz w:val="24"/>
+          <w:szCs w:val="24"/>
+        </w:rPr>
+        <w:t>UI – User Interface</w:t>
+      </w:r>
+    </w:p>
+    <w:p>
+      <w:pPr>
+        <w:pStyle w:val="ListParagraph"/>
+        <w:numPr>
+          <w:ilvl w:val="0"/>
+          <w:numId w:val="16"/>
+        </w:numPr>
+        <w:bidi w:val="0"/>
+        <w:spacing w:line="360" w:lineRule="auto"/>
+        <w:jc w:val="both"/>
+        <w:rPr>
+          <w:rFonts w:asciiTheme="majorBidi" w:hAnsiTheme="majorBidi" w:cstheme="majorBidi"/>
+          <w:sz w:val="24"/>
+          <w:szCs w:val="24"/>
+        </w:rPr>
+      </w:pPr>
+      <w:r>
+        <w:rPr>
+          <w:rFonts w:asciiTheme="majorBidi" w:hAnsiTheme="majorBidi" w:cstheme="majorBidi"/>
+          <w:sz w:val="24"/>
+          <w:szCs w:val="24"/>
+        </w:rPr>
+        <w:t>UX – User Experience</w:t>
+      </w:r>
+    </w:p>
+    <w:p>
+      <w:pPr>
+        <w:pStyle w:val="ListParagraph"/>
+        <w:numPr>
+          <w:ilvl w:val="0"/>
+          <w:numId w:val="16"/>
+        </w:numPr>
+        <w:bidi w:val="0"/>
+        <w:spacing w:line="360" w:lineRule="auto"/>
+        <w:jc w:val="both"/>
+        <w:rPr>
+          <w:rFonts w:asciiTheme="majorBidi" w:hAnsiTheme="majorBidi" w:cstheme="majorBidi"/>
+          <w:sz w:val="24"/>
+          <w:szCs w:val="24"/>
+        </w:rPr>
+      </w:pPr>
+      <w:r>
+        <w:rPr>
+          <w:rFonts w:asciiTheme="majorBidi" w:hAnsiTheme="majorBidi" w:cstheme="majorBidi"/>
+          <w:sz w:val="24"/>
+          <w:szCs w:val="24"/>
+        </w:rPr>
+        <w:t>URL – Uniform Resource Locator</w:t>
+      </w:r>
+    </w:p>
+    <w:p>
+      <w:pPr>
+        <w:pStyle w:val="ListParagraph"/>
+        <w:numPr>
+          <w:ilvl w:val="0"/>
+          <w:numId w:val="16"/>
+        </w:numPr>
+        <w:bidi w:val="0"/>
+        <w:spacing w:line="360" w:lineRule="auto"/>
+        <w:jc w:val="both"/>
+        <w:rPr>
+          <w:rFonts w:asciiTheme="majorBidi" w:hAnsiTheme="majorBidi" w:cstheme="majorBidi"/>
+          <w:sz w:val="24"/>
+          <w:szCs w:val="24"/>
+        </w:rPr>
+      </w:pPr>
+      <w:r>
+        <w:rPr>
+          <w:rFonts w:asciiTheme="majorBidi" w:hAnsiTheme="majorBidi" w:cstheme="majorBidi"/>
+          <w:sz w:val="24"/>
+          <w:szCs w:val="24"/>
+        </w:rPr>
+        <w:t>UUID – Universally Unique Identifier</w:t>
+      </w:r>
+    </w:p>
+    <w:p>
+      <w:pPr>
+        <w:pStyle w:val="ListParagraph"/>
+        <w:numPr>
+          <w:ilvl w:val="0"/>
+          <w:numId w:val="16"/>
+        </w:numPr>
+        <w:bidi w:val="0"/>
+        <w:spacing w:line="360" w:lineRule="auto"/>
+        <w:jc w:val="both"/>
+        <w:rPr>
+          <w:rFonts w:asciiTheme="majorBidi" w:hAnsiTheme="majorBidi" w:cstheme="majorBidi"/>
+          <w:sz w:val="24"/>
+          <w:szCs w:val="24"/>
+        </w:rPr>
+      </w:pPr>
+      <w:r>
+        <w:rPr>
+          <w:rFonts w:asciiTheme="majorBidi" w:hAnsiTheme="majorBidi" w:cstheme="majorBidi"/>
+          <w:sz w:val="24"/>
+          <w:szCs w:val="24"/>
+        </w:rPr>
+        <w:lastRenderedPageBreak/>
+        <w:t>4IR – Fourth Industrial Revolution</w:t>
+      </w:r>
+    </w:p>
+    <w:p>
+      <w:pPr>
+        <w:pStyle w:val="ListParagraph"/>
+        <w:numPr>
+          <w:ilvl w:val="0"/>
+          <w:numId w:val="16"/>
+        </w:numPr>
+        <w:bidi w:val="0"/>
+        <w:spacing w:line="360" w:lineRule="auto"/>
+        <w:jc w:val="both"/>
+        <w:rPr>
+          <w:rFonts w:asciiTheme="majorBidi" w:hAnsiTheme="majorBidi" w:cstheme="majorBidi"/>
+          <w:sz w:val="24"/>
+          <w:szCs w:val="24"/>
+        </w:rPr>
+      </w:pPr>
+      <w:r>
+        <w:rPr>
+          <w:rFonts w:asciiTheme="majorBidi" w:hAnsiTheme="majorBidi" w:cstheme="majorBidi"/>
+          <w:sz w:val="24"/>
+          <w:szCs w:val="24"/>
+        </w:rPr>
+        <w:t>JWT – JSON Web Token</w:t>
+      </w:r>
+    </w:p>
+    <w:p>
+      <w:pPr>
+        <w:pStyle w:val="ListParagraph"/>
+        <w:numPr>
+          <w:ilvl w:val="0"/>
+          <w:numId w:val="16"/>
+        </w:numPr>
+        <w:bidi w:val="0"/>
+        <w:spacing w:line="360" w:lineRule="auto"/>
+        <w:jc w:val="both"/>
+        <w:rPr>
+          <w:rFonts w:asciiTheme="majorBidi" w:hAnsiTheme="majorBidi" w:cstheme="majorBidi"/>
+          <w:sz w:val="24"/>
+          <w:szCs w:val="24"/>
+        </w:rPr>
+      </w:pPr>
+      <w:r>
+        <w:rPr>
+          <w:rFonts w:asciiTheme="majorBidi" w:hAnsiTheme="majorBidi" w:cstheme="majorBidi"/>
+          <w:sz w:val="24"/>
+          <w:szCs w:val="24"/>
+        </w:rPr>
+        <w:t>KYC – Know Your Customer</w:t>
+      </w:r>
+    </w:p>
+    <w:p>
+      <w:pPr>
+        <w:pStyle w:val="ListParagraph"/>
+        <w:numPr>
+          <w:ilvl w:val="0"/>
+          <w:numId w:val="16"/>
+        </w:numPr>
+        <w:bidi w:val="0"/>
+        <w:spacing w:line="360" w:lineRule="auto"/>
+        <w:jc w:val="both"/>
+        <w:rPr>
+          <w:rFonts w:asciiTheme="majorBidi" w:hAnsiTheme="majorBidi" w:cstheme="majorBidi"/>
+          <w:sz w:val="24"/>
+          <w:szCs w:val="24"/>
+        </w:rPr>
+      </w:pPr>
+      <w:r>
+        <w:rPr>
+          <w:rFonts w:asciiTheme="majorBidi" w:hAnsiTheme="majorBidi" w:cstheme="majorBidi"/>
+          <w:sz w:val="24"/>
+          <w:szCs w:val="24"/>
+        </w:rPr>
+        <w:t>MFA – Multi-Factor Authentication</w:t>
+      </w:r>
+    </w:p>
+    <w:p>
+      <w:pPr>
+        <w:pStyle w:val="ListParagraph"/>
+        <w:numPr>
+          <w:ilvl w:val="0"/>
+          <w:numId w:val="16"/>
+        </w:numPr>
+        <w:bidi w:val="0"/>
+        <w:spacing w:line="360" w:lineRule="auto"/>
+        <w:jc w:val="both"/>
+        <w:rPr>
+          <w:rFonts w:asciiTheme="majorBidi" w:hAnsiTheme="majorBidi" w:cstheme="majorBidi"/>
+          <w:sz w:val="24"/>
+          <w:szCs w:val="24"/>
+        </w:rPr>
+      </w:pPr>
+      <w:r>
+        <w:rPr>
+          <w:rFonts w:asciiTheme="majorBidi" w:hAnsiTheme="majorBidi" w:cstheme="majorBidi"/>
+          <w:sz w:val="24"/>
+          <w:szCs w:val="24"/>
+        </w:rPr>
+        <w:t>PDF – Portable Document Format</w:t>
+      </w:r>
+    </w:p>
+    <w:p>
+      <w:pPr>
+        <w:pStyle w:val="ListParagraph"/>
+        <w:numPr>
+          <w:ilvl w:val="0"/>
+          <w:numId w:val="16"/>
+        </w:numPr>
+        <w:bidi w:val="0"/>
+        <w:spacing w:line="360" w:lineRule="auto"/>
+        <w:jc w:val="both"/>
+        <w:rPr>
+          <w:rFonts w:asciiTheme="majorBidi" w:hAnsiTheme="majorBidi" w:cstheme="majorBidi"/>
+          <w:sz w:val="24"/>
+          <w:szCs w:val="24"/>
+        </w:rPr>
+      </w:pPr>
+      <w:r>
+        <w:rPr>
+          <w:rFonts w:asciiTheme="majorBidi" w:hAnsiTheme="majorBidi" w:cstheme="majorBidi"/>
+          <w:sz w:val="24"/>
+          <w:szCs w:val="24"/>
+        </w:rPr>
+        <w:t>REST – Representational State Transfer</w:t>
+      </w:r>
+    </w:p>
+    <w:p>
+      <w:pPr>
+        <w:pStyle w:val="ListParagraph"/>
+        <w:numPr>
+          <w:ilvl w:val="0"/>
+          <w:numId w:val="16"/>
+        </w:numPr>
+        <w:bidi w:val="0"/>
+        <w:spacing w:line="360" w:lineRule="auto"/>
+        <w:jc w:val="both"/>
+        <w:rPr>
+          <w:rFonts w:asciiTheme="majorBidi" w:hAnsiTheme="majorBidi" w:cstheme="majorBidi"/>
+          <w:sz w:val="24"/>
+          <w:szCs w:val="24"/>
+        </w:rPr>
+      </w:pPr>
+      <w:r>
+        <w:rPr>
+          <w:rFonts w:asciiTheme="majorBidi" w:hAnsiTheme="majorBidi" w:cstheme="majorBidi"/>
+          <w:sz w:val="24"/>
+          <w:szCs w:val="24"/>
+        </w:rPr>
+        <w:t>RPC – Remote Procedure Call</w:t>
+      </w:r>
+    </w:p>
+    <w:p>
+      <w:pPr>
+        <w:pStyle w:val="ListParagraph"/>
+        <w:numPr>
+          <w:ilvl w:val="0"/>
+          <w:numId w:val="16"/>
+        </w:numPr>
+        <w:bidi w:val="0"/>
+        <w:spacing w:line="360" w:lineRule="auto"/>
+        <w:jc w:val="both"/>
+        <w:rPr>
+          <w:rFonts w:asciiTheme="majorBidi" w:hAnsiTheme="majorBidi" w:cstheme="majorBidi"/>
+          <w:sz w:val="24"/>
+          <w:szCs w:val="24"/>
+        </w:rPr>
+      </w:pPr>
+      <w:r>
+        <w:rPr>
+          <w:rFonts w:asciiTheme="majorBidi" w:hAnsiTheme="majorBidi" w:cstheme="majorBidi"/>
+          <w:sz w:val="24"/>
+          <w:szCs w:val="24"/>
+        </w:rPr>
+        <w:t>TypeScript – Typed Superset of JavaScript</w:t>
+      </w:r>
+    </w:p>
+    <w:p>
+      <w:pPr>
+        <w:pStyle w:val="ListParagraph"/>
+        <w:numPr>
+          <w:ilvl w:val="0"/>
+          <w:numId w:val="16"/>
+        </w:numPr>
+        <w:bidi w:val="0"/>
+        <w:spacing w:line="360" w:lineRule="auto"/>
+        <w:jc w:val="both"/>
+        <w:rPr>
+          <w:rFonts w:asciiTheme="majorBidi" w:hAnsiTheme="majorBidi" w:cstheme="majorBidi"/>
+          <w:sz w:val="24"/>
+          <w:szCs w:val="24"/>
+        </w:rPr>
+      </w:pPr>
+      <w:r>
+        <w:rPr>
+          <w:rFonts w:asciiTheme="majorBidi" w:hAnsiTheme="majorBidi" w:cstheme="majorBidi"/>
+          <w:sz w:val="24"/>
+          <w:szCs w:val="24"/>
+        </w:rPr>
+        <w:t>Next.js – React-Based Full-Stack Framework</w:t>
+      </w:r>
+    </w:p>
+    <w:p>
+      <w:pPr>
+        <w:pStyle w:val="ListParagraph"/>
+        <w:numPr>
+          <w:ilvl w:val="0"/>
+          <w:numId w:val="16"/>
+        </w:numPr>
+        <w:bidi w:val="0"/>
+        <w:spacing w:line="360" w:lineRule="auto"/>
+        <w:jc w:val="both"/>
+        <w:rPr>
+          <w:rFonts w:asciiTheme="majorBidi" w:hAnsiTheme="majorBidi" w:cstheme="majorBidi"/>
+          <w:sz w:val="24"/>
+          <w:szCs w:val="24"/>
+        </w:rPr>
+      </w:pPr>
+      <w:r>
+        <w:rPr>
+          <w:rFonts w:asciiTheme="majorBidi" w:hAnsiTheme="majorBidi" w:cstheme="majorBidi"/>
+          <w:sz w:val="24"/>
+          <w:szCs w:val="24"/>
+        </w:rPr>
+        <w:t>Node.js – JavaScript Runtime Environment</w:t>
+      </w:r>
+    </w:p>
+    <w:p>
+      <w:pPr>
+        <w:pStyle w:val="ListParagraph"/>
+        <w:numPr>
+          <w:ilvl w:val="0"/>
+          <w:numId w:val="16"/>
+        </w:numPr>
+        <w:bidi w:val="0"/>
+        <w:spacing w:line="360" w:lineRule="auto"/>
+        <w:jc w:val="both"/>
+        <w:rPr>
+          <w:rFonts w:asciiTheme="majorBidi" w:hAnsiTheme="majorBidi" w:cstheme="majorBidi"/>
+          <w:sz w:val="24"/>
+          <w:szCs w:val="24"/>
+        </w:rPr>
+      </w:pPr>
+      <w:r>
+        <w:rPr>
+          <w:rFonts w:asciiTheme="majorBidi" w:hAnsiTheme="majorBidi" w:cstheme="majorBidi"/>
+          <w:sz w:val="24"/>
+          <w:szCs w:val="24"/>
+        </w:rPr>
+        <w:t xml:space="preserve">PostgreSQL – </w:t>
+      </w:r>
+      <w:proofErr w:type="gramStart"/>
+      <w:r>
+        <w:rPr>
+          <w:rFonts w:asciiTheme="majorBidi" w:hAnsiTheme="majorBidi" w:cstheme="majorBidi"/>
+          <w:sz w:val="24"/>
+          <w:szCs w:val="24"/>
+        </w:rPr>
+        <w:t>Open Source</w:t>
+      </w:r>
+      <w:proofErr w:type="gramEnd"/>
+      <w:r>
+        <w:rPr>
+          <w:rFonts w:asciiTheme="majorBidi" w:hAnsiTheme="majorBidi" w:cstheme="majorBidi"/>
+          <w:sz w:val="24"/>
+          <w:szCs w:val="24"/>
+        </w:rPr>
+        <w:t xml:space="preserve"> Relational Database Management System</w:t>
+      </w:r>
+    </w:p>
+    <w:p>
+      <w:pPr>
+        <w:pStyle w:val="ListParagraph"/>
+        <w:numPr>
+          <w:ilvl w:val="0"/>
+          <w:numId w:val="16"/>
+        </w:numPr>
+        <w:bidi w:val="0"/>
+        <w:spacing w:line="360" w:lineRule="auto"/>
+        <w:jc w:val="both"/>
+        <w:rPr>
+          <w:rFonts w:asciiTheme="majorBidi" w:hAnsiTheme="majorBidi" w:cstheme="majorBidi"/>
+          <w:sz w:val="24"/>
+          <w:szCs w:val="24"/>
+        </w:rPr>
+      </w:pPr>
+      <w:r>
+        <w:rPr>
+          <w:rFonts w:asciiTheme="majorBidi" w:hAnsiTheme="majorBidi" w:cstheme="majorBidi"/>
+          <w:sz w:val="24"/>
+          <w:szCs w:val="24"/>
+        </w:rPr>
+        <w:t>Zaad – Mobile Money Payment Service</w:t>
+      </w:r>
+    </w:p>
+    <w:p>
+      <w:pPr>
+        <w:pStyle w:val="ListParagraph"/>
+        <w:numPr>
+          <w:ilvl w:val="0"/>
+          <w:numId w:val="16"/>
+        </w:numPr>
+        <w:bidi w:val="0"/>
+        <w:spacing w:line="360" w:lineRule="auto"/>
+        <w:jc w:val="both"/>
+        <w:rPr>
+          <w:rFonts w:asciiTheme="majorBidi" w:hAnsiTheme="majorBidi" w:cstheme="majorBidi"/>
+          <w:sz w:val="24"/>
+          <w:szCs w:val="24"/>
+        </w:rPr>
+      </w:pPr>
+      <w:proofErr w:type="spellStart"/>
+      <w:r>
+        <w:rPr>
+          <w:rFonts w:asciiTheme="majorBidi" w:hAnsiTheme="majorBidi" w:cstheme="majorBidi"/>
+          <w:sz w:val="24"/>
+          <w:szCs w:val="24"/>
+        </w:rPr>
+        <w:t>eDahab</w:t>
+      </w:r>
+      <w:proofErr w:type="spellEnd"/>
+      <w:r>
+        <w:rPr>
+          <w:rFonts w:asciiTheme="majorBidi" w:hAnsiTheme="majorBidi" w:cstheme="majorBidi"/>
+          <w:sz w:val="24"/>
+          <w:szCs w:val="24"/>
+        </w:rPr>
+        <w:t xml:space="preserve"> – Electronic Mobile Wallet Payment Service</w:t>
+      </w:r>
+    </w:p>
+    <w:p>
+      <w:pPr>
+        <w:pStyle w:val="ListParagraph"/>
+        <w:numPr>
+          <w:ilvl w:val="0"/>
+          <w:numId w:val="16"/>
+        </w:numPr>
+        <w:bidi w:val="0"/>
+        <w:spacing w:line="360" w:lineRule="auto"/>
+        <w:jc w:val="both"/>
+        <w:rPr>
+          <w:rFonts w:asciiTheme="majorBidi" w:hAnsiTheme="majorBidi" w:cstheme="majorBidi"/>
+          <w:sz w:val="24"/>
+          <w:szCs w:val="24"/>
+        </w:rPr>
+      </w:pPr>
+      <w:proofErr w:type="spellStart"/>
+      <w:r>
+        <w:rPr>
+          <w:rFonts w:asciiTheme="majorBidi" w:hAnsiTheme="majorBidi" w:cstheme="majorBidi"/>
+          <w:sz w:val="24"/>
+          <w:szCs w:val="24"/>
+        </w:rPr>
+        <w:t>Wadaag</w:t>
+      </w:r>
+      <w:proofErr w:type="spellEnd"/>
+      <w:r>
+        <w:rPr>
+          <w:rFonts w:asciiTheme="majorBidi" w:hAnsiTheme="majorBidi" w:cstheme="majorBidi"/>
+          <w:sz w:val="24"/>
+          <w:szCs w:val="24"/>
+        </w:rPr>
+        <w:t xml:space="preserve"> Pay – Digital Payment Service</w:t>
+      </w:r>
+    </w:p>
+    <w:p>
+      <w:pPr>
+        <w:pStyle w:val="ListParagraph"/>
+        <w:numPr>
+          <w:ilvl w:val="0"/>
+          <w:numId w:val="16"/>
+        </w:numPr>
+        <w:bidi w:val="0"/>
+        <w:spacing w:line="360" w:lineRule="auto"/>
+        <w:jc w:val="both"/>
+        <w:rPr>
+          <w:rFonts w:asciiTheme="majorBidi" w:hAnsiTheme="majorBidi" w:cstheme="majorBidi"/>
+          <w:sz w:val="24"/>
+          <w:szCs w:val="24"/>
+        </w:rPr>
+      </w:pPr>
+      <w:r>
+        <w:rPr>
+          <w:rFonts w:asciiTheme="majorBidi" w:hAnsiTheme="majorBidi" w:cstheme="majorBidi"/>
+          <w:sz w:val="24"/>
+          <w:szCs w:val="24"/>
+        </w:rPr>
+        <w:t>Premier Wallet – Mobile Wallet Payment Platform</w:t>
+      </w:r>
     </w:p>
     <w:p>
       <w:pPr>
@@ -5502,10 +6753,751 @@
           <w:b/>
           <w:bCs/>
         </w:rPr>
+        <w:t>CHAPTER TWO: LITERATURE REVIEW</w:t>
+      </w:r>
+      <w:bookmarkEnd w:id="14"/>
+    </w:p>
+    <w:p>
+      <w:pPr>
+        <w:pStyle w:val="Heading2"/>
+        <w:bidi w:val="0"/>
+        <w:spacing w:line="360" w:lineRule="auto"/>
+        <w:rPr>
+          <w:b/>
+          <w:bCs/>
+        </w:rPr>
+      </w:pPr>
+      <w:bookmarkStart w:id="15" w:name="_Toc228527521"/>
+      <w:r>
+        <w:rPr>
+          <w:b/>
+          <w:bCs/>
+        </w:rPr>
+        <w:t>2.1 Introduction</w:t>
+      </w:r>
+      <w:bookmarkEnd w:id="15"/>
+    </w:p>
+    <w:p>
+      <w:pPr>
+        <w:bidi w:val="0"/>
+        <w:spacing w:line="360" w:lineRule="auto"/>
+        <w:jc w:val="both"/>
+        <w:rPr>
+          <w:rFonts w:asciiTheme="majorBidi" w:hAnsiTheme="majorBidi" w:cstheme="majorBidi"/>
+          <w:sz w:val="24"/>
+          <w:szCs w:val="24"/>
+        </w:rPr>
+      </w:pPr>
+      <w:r>
+        <w:rPr>
+          <w:rFonts w:asciiTheme="majorBidi" w:hAnsiTheme="majorBidi" w:cstheme="majorBidi"/>
+          <w:sz w:val="24"/>
+          <w:szCs w:val="24"/>
+        </w:rPr>
+        <w:t>The literature review serves as a critical foundation for understanding the intersection of real estate management, web technologies, and automated management workflows. In recent years, the shift from traditional manual property management to digital ecosystems has accelerated, driven by the need for transparency, speed, and data security. This chapter explores existing studies on property technology (PropTech), evaluates the effectiveness of current real-time systems, and reviews the theories that govern user adoption of new software. By analyzing global and regional empirical evidence, this review identifies the specific gaps that the GuriGate system aims to address within the Somaliland real estate market.</w:t>
+      </w:r>
+    </w:p>
+    <w:p>
+      <w:pPr>
+        <w:pStyle w:val="Heading2"/>
+        <w:bidi w:val="0"/>
+        <w:spacing w:line="360" w:lineRule="auto"/>
+        <w:rPr>
+          <w:b/>
+          <w:bCs/>
+        </w:rPr>
+      </w:pPr>
+      <w:bookmarkStart w:id="16" w:name="_Toc228527522"/>
+      <w:r>
+        <w:rPr>
+          <w:b/>
+          <w:bCs/>
+        </w:rPr>
+        <w:t>2.2 Related Terminologies</w:t>
+      </w:r>
+      <w:bookmarkEnd w:id="16"/>
+    </w:p>
+    <w:p>
+      <w:pPr>
+        <w:bidi w:val="0"/>
+        <w:spacing w:line="360" w:lineRule="auto"/>
+        <w:jc w:val="both"/>
+        <w:rPr>
+          <w:rFonts w:asciiTheme="majorBidi" w:hAnsiTheme="majorBidi" w:cstheme="majorBidi"/>
+          <w:sz w:val="24"/>
+          <w:szCs w:val="24"/>
+        </w:rPr>
+      </w:pPr>
+      <w:r>
+        <w:rPr>
+          <w:rFonts w:asciiTheme="majorBidi" w:hAnsiTheme="majorBidi" w:cstheme="majorBidi"/>
+          <w:sz w:val="24"/>
+          <w:szCs w:val="24"/>
+        </w:rPr>
+        <w:t>To provide a clear context for this research, the following technical and industry-specific terms are defined:</w:t>
+      </w:r>
+    </w:p>
+    <w:p>
+      <w:pPr>
+        <w:bidi w:val="0"/>
+        <w:spacing w:line="360" w:lineRule="auto"/>
+        <w:jc w:val="both"/>
+        <w:rPr>
+          <w:rFonts w:asciiTheme="majorBidi" w:hAnsiTheme="majorBidi" w:cstheme="majorBidi"/>
+          <w:sz w:val="24"/>
+          <w:szCs w:val="24"/>
+        </w:rPr>
+      </w:pPr>
+      <w:r>
+        <w:rPr>
+          <w:rFonts w:asciiTheme="majorBidi" w:hAnsiTheme="majorBidi" w:cstheme="majorBidi"/>
+          <w:b/>
+          <w:bCs/>
+          <w:sz w:val="24"/>
+          <w:szCs w:val="24"/>
+        </w:rPr>
         <w:lastRenderedPageBreak/>
-        <w:t>CHAPTER TWO: LITERATURE REVIEW</w:t>
-      </w:r>
-      <w:bookmarkEnd w:id="14"/>
+        <w:t>PropTech (Property Technology):</w:t>
+      </w:r>
+      <w:r>
+        <w:rPr>
+          <w:rFonts w:asciiTheme="majorBidi" w:hAnsiTheme="majorBidi" w:cstheme="majorBidi"/>
+          <w:sz w:val="24"/>
+          <w:szCs w:val="24"/>
+        </w:rPr>
+        <w:t xml:space="preserve"> A broad categorization of software and platforms designed to optimize how people buy, sell, rent, and manage property [1].</w:t>
+      </w:r>
+    </w:p>
+    <w:p>
+      <w:pPr>
+        <w:bidi w:val="0"/>
+        <w:spacing w:line="360" w:lineRule="auto"/>
+        <w:jc w:val="both"/>
+        <w:rPr>
+          <w:rFonts w:asciiTheme="majorBidi" w:hAnsiTheme="majorBidi" w:cstheme="majorBidi"/>
+          <w:sz w:val="24"/>
+          <w:szCs w:val="24"/>
+        </w:rPr>
+      </w:pPr>
+      <w:r>
+        <w:rPr>
+          <w:rFonts w:asciiTheme="majorBidi" w:hAnsiTheme="majorBidi" w:cstheme="majorBidi"/>
+          <w:b/>
+          <w:bCs/>
+          <w:sz w:val="24"/>
+          <w:szCs w:val="24"/>
+        </w:rPr>
+        <w:t>Real-Time System:</w:t>
+      </w:r>
+      <w:r>
+        <w:rPr>
+          <w:rFonts w:asciiTheme="majorBidi" w:hAnsiTheme="majorBidi" w:cstheme="majorBidi"/>
+          <w:sz w:val="24"/>
+          <w:szCs w:val="24"/>
+        </w:rPr>
+        <w:t xml:space="preserve"> In the context of this study, it refers to a web architecture where data updates (such as a property becoming "unavailable") are reflected across all user interfaces instantaneously without manual refreshing [4].</w:t>
+      </w:r>
+    </w:p>
+    <w:p>
+      <w:pPr>
+        <w:bidi w:val="0"/>
+        <w:spacing w:line="360" w:lineRule="auto"/>
+        <w:jc w:val="both"/>
+        <w:rPr>
+          <w:rFonts w:asciiTheme="majorBidi" w:hAnsiTheme="majorBidi" w:cstheme="majorBidi"/>
+          <w:sz w:val="24"/>
+          <w:szCs w:val="24"/>
+        </w:rPr>
+      </w:pPr>
+      <w:r>
+        <w:rPr>
+          <w:rFonts w:asciiTheme="majorBidi" w:hAnsiTheme="majorBidi" w:cstheme="majorBidi"/>
+          <w:b/>
+          <w:bCs/>
+          <w:sz w:val="24"/>
+          <w:szCs w:val="24"/>
+        </w:rPr>
+        <w:t>Database-driven Logic Engine:</w:t>
+      </w:r>
+      <w:r>
+        <w:rPr>
+          <w:rFonts w:asciiTheme="majorBidi" w:hAnsiTheme="majorBidi" w:cstheme="majorBidi"/>
+          <w:sz w:val="24"/>
+          <w:szCs w:val="24"/>
+        </w:rPr>
+        <w:t xml:space="preserve"> A component of the system that applies logical rules to a knowledge base (user data and property attributes) to provide personalized recommendations [5].</w:t>
+      </w:r>
+    </w:p>
+    <w:p>
+      <w:pPr>
+        <w:bidi w:val="0"/>
+        <w:spacing w:line="360" w:lineRule="auto"/>
+        <w:jc w:val="both"/>
+        <w:rPr>
+          <w:rFonts w:asciiTheme="majorBidi" w:hAnsiTheme="majorBidi" w:cstheme="majorBidi"/>
+          <w:sz w:val="24"/>
+          <w:szCs w:val="24"/>
+        </w:rPr>
+      </w:pPr>
+      <w:r>
+        <w:rPr>
+          <w:rFonts w:asciiTheme="majorBidi" w:hAnsiTheme="majorBidi" w:cstheme="majorBidi"/>
+          <w:b/>
+          <w:bCs/>
+          <w:sz w:val="24"/>
+          <w:szCs w:val="24"/>
+        </w:rPr>
+        <w:t>MVC (Model-View-Controller):</w:t>
+      </w:r>
+      <w:r>
+        <w:rPr>
+          <w:rFonts w:asciiTheme="majorBidi" w:hAnsiTheme="majorBidi" w:cstheme="majorBidi"/>
+          <w:sz w:val="24"/>
+          <w:szCs w:val="24"/>
+        </w:rPr>
+        <w:t xml:space="preserve"> A software architectural pattern used to separate the internal representation of information from the ways information is presented to and accepted from the user [13].</w:t>
+      </w:r>
+    </w:p>
+    <w:p>
+      <w:pPr>
+        <w:bidi w:val="0"/>
+        <w:spacing w:line="360" w:lineRule="auto"/>
+        <w:jc w:val="both"/>
+        <w:rPr>
+          <w:rFonts w:asciiTheme="majorBidi" w:hAnsiTheme="majorBidi" w:cstheme="majorBidi"/>
+          <w:sz w:val="24"/>
+          <w:szCs w:val="24"/>
+        </w:rPr>
+      </w:pPr>
+      <w:r>
+        <w:rPr>
+          <w:rFonts w:asciiTheme="majorBidi" w:hAnsiTheme="majorBidi" w:cstheme="majorBidi"/>
+          <w:b/>
+          <w:bCs/>
+          <w:sz w:val="24"/>
+          <w:szCs w:val="24"/>
+        </w:rPr>
+        <w:t>Informational Asymmetry:</w:t>
+      </w:r>
+      <w:r>
+        <w:rPr>
+          <w:rFonts w:asciiTheme="majorBidi" w:hAnsiTheme="majorBidi" w:cstheme="majorBidi"/>
+          <w:sz w:val="24"/>
+          <w:szCs w:val="24"/>
+        </w:rPr>
+        <w:t xml:space="preserve"> A situation in the real estate market where one party (usually the agent/owner) has more or better information than the other (the seeker), often leading to exploitation [11].</w:t>
+      </w:r>
+    </w:p>
+    <w:p>
+      <w:pPr>
+        <w:bidi w:val="0"/>
+        <w:spacing w:line="360" w:lineRule="auto"/>
+        <w:jc w:val="both"/>
+        <w:rPr>
+          <w:rFonts w:asciiTheme="majorBidi" w:hAnsiTheme="majorBidi" w:cstheme="majorBidi"/>
+          <w:sz w:val="24"/>
+          <w:szCs w:val="24"/>
+        </w:rPr>
+      </w:pPr>
+      <w:r>
+        <w:rPr>
+          <w:rFonts w:asciiTheme="majorBidi" w:hAnsiTheme="majorBidi" w:cstheme="majorBidi"/>
+          <w:b/>
+          <w:bCs/>
+          <w:sz w:val="24"/>
+          <w:szCs w:val="24"/>
+        </w:rPr>
+        <w:t>Login –</w:t>
+      </w:r>
+      <w:r>
+        <w:rPr>
+          <w:rFonts w:asciiTheme="majorBidi" w:hAnsiTheme="majorBidi" w:cstheme="majorBidi"/>
+          <w:sz w:val="24"/>
+          <w:szCs w:val="24"/>
+        </w:rPr>
+        <w:t xml:space="preserve"> Process of accessing the system using valid credentials. </w:t>
+      </w:r>
+    </w:p>
+    <w:p>
+      <w:pPr>
+        <w:bidi w:val="0"/>
+        <w:spacing w:line="360" w:lineRule="auto"/>
+        <w:jc w:val="both"/>
+        <w:rPr>
+          <w:rFonts w:asciiTheme="majorBidi" w:hAnsiTheme="majorBidi" w:cstheme="majorBidi"/>
+          <w:sz w:val="24"/>
+          <w:szCs w:val="24"/>
+        </w:rPr>
+      </w:pPr>
+      <w:r>
+        <w:rPr>
+          <w:rFonts w:asciiTheme="majorBidi" w:hAnsiTheme="majorBidi" w:cstheme="majorBidi"/>
+          <w:b/>
+          <w:bCs/>
+          <w:sz w:val="24"/>
+          <w:szCs w:val="24"/>
+        </w:rPr>
+        <w:t>Authentication –</w:t>
+      </w:r>
+      <w:r>
+        <w:rPr>
+          <w:rFonts w:asciiTheme="majorBidi" w:hAnsiTheme="majorBidi" w:cstheme="majorBidi"/>
+          <w:sz w:val="24"/>
+          <w:szCs w:val="24"/>
+        </w:rPr>
+        <w:t xml:space="preserve"> Verification of user identity before system access. </w:t>
+      </w:r>
+    </w:p>
+    <w:p>
+      <w:pPr>
+        <w:bidi w:val="0"/>
+        <w:spacing w:line="360" w:lineRule="auto"/>
+        <w:jc w:val="both"/>
+        <w:rPr>
+          <w:rFonts w:asciiTheme="majorBidi" w:hAnsiTheme="majorBidi" w:cstheme="majorBidi"/>
+          <w:sz w:val="24"/>
+          <w:szCs w:val="24"/>
+        </w:rPr>
+      </w:pPr>
+      <w:r>
+        <w:rPr>
+          <w:rFonts w:asciiTheme="majorBidi" w:hAnsiTheme="majorBidi" w:cstheme="majorBidi"/>
+          <w:b/>
+          <w:bCs/>
+          <w:sz w:val="24"/>
+          <w:szCs w:val="24"/>
+        </w:rPr>
+        <w:t>Authorization –</w:t>
+      </w:r>
+      <w:r>
+        <w:rPr>
+          <w:rFonts w:asciiTheme="majorBidi" w:hAnsiTheme="majorBidi" w:cstheme="majorBidi"/>
+          <w:sz w:val="24"/>
+          <w:szCs w:val="24"/>
+        </w:rPr>
+        <w:t xml:space="preserve"> Process of determining user permissions and access levels. </w:t>
+      </w:r>
+    </w:p>
+    <w:p>
+      <w:pPr>
+        <w:bidi w:val="0"/>
+        <w:spacing w:line="360" w:lineRule="auto"/>
+        <w:jc w:val="both"/>
+        <w:rPr>
+          <w:rFonts w:asciiTheme="majorBidi" w:hAnsiTheme="majorBidi" w:cstheme="majorBidi"/>
+          <w:sz w:val="24"/>
+          <w:szCs w:val="24"/>
+        </w:rPr>
+      </w:pPr>
+      <w:r>
+        <w:rPr>
+          <w:rFonts w:asciiTheme="majorBidi" w:hAnsiTheme="majorBidi" w:cstheme="majorBidi"/>
+          <w:b/>
+          <w:bCs/>
+          <w:sz w:val="24"/>
+          <w:szCs w:val="24"/>
+        </w:rPr>
+        <w:t>Property Listing –</w:t>
+      </w:r>
+      <w:r>
+        <w:rPr>
+          <w:rFonts w:asciiTheme="majorBidi" w:hAnsiTheme="majorBidi" w:cstheme="majorBidi"/>
+          <w:sz w:val="24"/>
+          <w:szCs w:val="24"/>
+        </w:rPr>
+        <w:t xml:space="preserve"> Digital record of a property available for sale, rent, or booking. </w:t>
+      </w:r>
+    </w:p>
+    <w:p>
+      <w:pPr>
+        <w:bidi w:val="0"/>
+        <w:spacing w:line="360" w:lineRule="auto"/>
+        <w:jc w:val="both"/>
+        <w:rPr>
+          <w:rFonts w:asciiTheme="majorBidi" w:hAnsiTheme="majorBidi" w:cstheme="majorBidi"/>
+          <w:sz w:val="24"/>
+          <w:szCs w:val="24"/>
+        </w:rPr>
+      </w:pPr>
+      <w:r>
+        <w:rPr>
+          <w:rFonts w:asciiTheme="majorBidi" w:hAnsiTheme="majorBidi" w:cstheme="majorBidi"/>
+          <w:b/>
+          <w:bCs/>
+          <w:sz w:val="24"/>
+          <w:szCs w:val="24"/>
+        </w:rPr>
+        <w:t>Booking –</w:t>
+      </w:r>
+      <w:r>
+        <w:rPr>
+          <w:rFonts w:asciiTheme="majorBidi" w:hAnsiTheme="majorBidi" w:cstheme="majorBidi"/>
+          <w:sz w:val="24"/>
+          <w:szCs w:val="24"/>
+        </w:rPr>
+        <w:t xml:space="preserve"> Reservation of a property for a specified period. </w:t>
+      </w:r>
+    </w:p>
+    <w:p>
+      <w:pPr>
+        <w:bidi w:val="0"/>
+        <w:spacing w:line="360" w:lineRule="auto"/>
+        <w:jc w:val="both"/>
+        <w:rPr>
+          <w:rFonts w:asciiTheme="majorBidi" w:hAnsiTheme="majorBidi" w:cstheme="majorBidi"/>
+          <w:sz w:val="24"/>
+          <w:szCs w:val="24"/>
+        </w:rPr>
+      </w:pPr>
+      <w:r>
+        <w:rPr>
+          <w:rFonts w:asciiTheme="majorBidi" w:hAnsiTheme="majorBidi" w:cstheme="majorBidi"/>
+          <w:b/>
+          <w:bCs/>
+          <w:sz w:val="24"/>
+          <w:szCs w:val="24"/>
+        </w:rPr>
+        <w:t>Contract –</w:t>
+      </w:r>
+      <w:r>
+        <w:rPr>
+          <w:rFonts w:asciiTheme="majorBidi" w:hAnsiTheme="majorBidi" w:cstheme="majorBidi"/>
+          <w:sz w:val="24"/>
+          <w:szCs w:val="24"/>
+        </w:rPr>
+        <w:t xml:space="preserve"> Legal agreement between landlord and tenant. </w:t>
+      </w:r>
+    </w:p>
+    <w:p>
+      <w:pPr>
+        <w:bidi w:val="0"/>
+        <w:spacing w:line="360" w:lineRule="auto"/>
+        <w:jc w:val="both"/>
+        <w:rPr>
+          <w:rFonts w:asciiTheme="majorBidi" w:hAnsiTheme="majorBidi" w:cstheme="majorBidi"/>
+          <w:sz w:val="24"/>
+          <w:szCs w:val="24"/>
+        </w:rPr>
+      </w:pPr>
+      <w:r>
+        <w:rPr>
+          <w:rFonts w:asciiTheme="majorBidi" w:hAnsiTheme="majorBidi" w:cstheme="majorBidi"/>
+          <w:b/>
+          <w:bCs/>
+          <w:sz w:val="24"/>
+          <w:szCs w:val="24"/>
+        </w:rPr>
+        <w:t>Tenant –</w:t>
+      </w:r>
+      <w:r>
+        <w:rPr>
+          <w:rFonts w:asciiTheme="majorBidi" w:hAnsiTheme="majorBidi" w:cstheme="majorBidi"/>
+          <w:sz w:val="24"/>
+          <w:szCs w:val="24"/>
+        </w:rPr>
+        <w:t xml:space="preserve"> Individual renting a property. </w:t>
+      </w:r>
+    </w:p>
+    <w:p>
+      <w:pPr>
+        <w:bidi w:val="0"/>
+        <w:spacing w:line="360" w:lineRule="auto"/>
+        <w:jc w:val="both"/>
+        <w:rPr>
+          <w:rFonts w:asciiTheme="majorBidi" w:hAnsiTheme="majorBidi" w:cstheme="majorBidi"/>
+          <w:sz w:val="24"/>
+          <w:szCs w:val="24"/>
+        </w:rPr>
+      </w:pPr>
+      <w:r>
+        <w:rPr>
+          <w:rFonts w:asciiTheme="majorBidi" w:hAnsiTheme="majorBidi" w:cstheme="majorBidi"/>
+          <w:b/>
+          <w:bCs/>
+          <w:sz w:val="24"/>
+          <w:szCs w:val="24"/>
+        </w:rPr>
+        <w:t>Landlord –</w:t>
+      </w:r>
+      <w:r>
+        <w:rPr>
+          <w:rFonts w:asciiTheme="majorBidi" w:hAnsiTheme="majorBidi" w:cstheme="majorBidi"/>
+          <w:sz w:val="24"/>
+          <w:szCs w:val="24"/>
+        </w:rPr>
+        <w:t xml:space="preserve"> Property owner offering property for rent. </w:t>
+      </w:r>
+    </w:p>
+    <w:p>
+      <w:pPr>
+        <w:bidi w:val="0"/>
+        <w:spacing w:line="360" w:lineRule="auto"/>
+        <w:jc w:val="both"/>
+        <w:rPr>
+          <w:rFonts w:asciiTheme="majorBidi" w:hAnsiTheme="majorBidi" w:cstheme="majorBidi"/>
+          <w:sz w:val="24"/>
+          <w:szCs w:val="24"/>
+        </w:rPr>
+      </w:pPr>
+      <w:r>
+        <w:rPr>
+          <w:rFonts w:asciiTheme="majorBidi" w:hAnsiTheme="majorBidi" w:cstheme="majorBidi"/>
+          <w:b/>
+          <w:bCs/>
+          <w:sz w:val="24"/>
+          <w:szCs w:val="24"/>
+        </w:rPr>
+        <w:t>Marketplace –</w:t>
+      </w:r>
+      <w:r>
+        <w:rPr>
+          <w:rFonts w:asciiTheme="majorBidi" w:hAnsiTheme="majorBidi" w:cstheme="majorBidi"/>
+          <w:sz w:val="24"/>
+          <w:szCs w:val="24"/>
+        </w:rPr>
+        <w:t xml:space="preserve"> Property discovery and transaction environment. </w:t>
+      </w:r>
+    </w:p>
+    <w:p>
+      <w:pPr>
+        <w:bidi w:val="0"/>
+        <w:spacing w:line="360" w:lineRule="auto"/>
+        <w:jc w:val="both"/>
+        <w:rPr>
+          <w:rFonts w:asciiTheme="majorBidi" w:hAnsiTheme="majorBidi" w:cstheme="majorBidi"/>
+          <w:sz w:val="24"/>
+          <w:szCs w:val="24"/>
+        </w:rPr>
+      </w:pPr>
+      <w:r>
+        <w:rPr>
+          <w:rFonts w:asciiTheme="majorBidi" w:hAnsiTheme="majorBidi" w:cstheme="majorBidi"/>
+          <w:b/>
+          <w:bCs/>
+          <w:sz w:val="24"/>
+          <w:szCs w:val="24"/>
+        </w:rPr>
+        <w:t>Dashboard –</w:t>
+      </w:r>
+      <w:r>
+        <w:rPr>
+          <w:rFonts w:asciiTheme="majorBidi" w:hAnsiTheme="majorBidi" w:cstheme="majorBidi"/>
+          <w:sz w:val="24"/>
+          <w:szCs w:val="24"/>
+        </w:rPr>
+        <w:t xml:space="preserve"> Centralized interface for managing system activities. </w:t>
+      </w:r>
+    </w:p>
+    <w:p>
+      <w:pPr>
+        <w:bidi w:val="0"/>
+        <w:spacing w:line="360" w:lineRule="auto"/>
+        <w:jc w:val="both"/>
+        <w:rPr>
+          <w:rFonts w:asciiTheme="majorBidi" w:hAnsiTheme="majorBidi" w:cstheme="majorBidi"/>
+          <w:sz w:val="24"/>
+          <w:szCs w:val="24"/>
+        </w:rPr>
+      </w:pPr>
+      <w:r>
+        <w:rPr>
+          <w:rFonts w:asciiTheme="majorBidi" w:hAnsiTheme="majorBidi" w:cstheme="majorBidi"/>
+          <w:b/>
+          <w:bCs/>
+          <w:sz w:val="24"/>
+          <w:szCs w:val="24"/>
+        </w:rPr>
+        <w:t>Notification –</w:t>
+      </w:r>
+      <w:r>
+        <w:rPr>
+          <w:rFonts w:asciiTheme="majorBidi" w:hAnsiTheme="majorBidi" w:cstheme="majorBidi"/>
+          <w:sz w:val="24"/>
+          <w:szCs w:val="24"/>
+        </w:rPr>
+        <w:t xml:space="preserve"> Automated alert generated by the system. </w:t>
+      </w:r>
+    </w:p>
+    <w:p>
+      <w:pPr>
+        <w:bidi w:val="0"/>
+        <w:spacing w:line="360" w:lineRule="auto"/>
+        <w:jc w:val="both"/>
+        <w:rPr>
+          <w:rFonts w:asciiTheme="majorBidi" w:hAnsiTheme="majorBidi" w:cstheme="majorBidi"/>
+          <w:sz w:val="24"/>
+          <w:szCs w:val="24"/>
+        </w:rPr>
+      </w:pPr>
+      <w:r>
+        <w:rPr>
+          <w:rFonts w:asciiTheme="majorBidi" w:hAnsiTheme="majorBidi" w:cstheme="majorBidi"/>
+          <w:b/>
+          <w:bCs/>
+          <w:sz w:val="24"/>
+          <w:szCs w:val="24"/>
+        </w:rPr>
+        <w:t>Approval Workflow –</w:t>
+      </w:r>
+      <w:r>
+        <w:rPr>
+          <w:rFonts w:asciiTheme="majorBidi" w:hAnsiTheme="majorBidi" w:cstheme="majorBidi"/>
+          <w:sz w:val="24"/>
+          <w:szCs w:val="24"/>
+        </w:rPr>
+        <w:t xml:space="preserve"> Process of reviewing and approving property listings. </w:t>
+      </w:r>
+    </w:p>
+    <w:p>
+      <w:pPr>
+        <w:bidi w:val="0"/>
+        <w:spacing w:line="360" w:lineRule="auto"/>
+        <w:jc w:val="both"/>
+        <w:rPr>
+          <w:rFonts w:asciiTheme="majorBidi" w:hAnsiTheme="majorBidi" w:cstheme="majorBidi"/>
+          <w:sz w:val="24"/>
+          <w:szCs w:val="24"/>
+        </w:rPr>
+      </w:pPr>
+      <w:r>
+        <w:rPr>
+          <w:rFonts w:asciiTheme="majorBidi" w:hAnsiTheme="majorBidi" w:cstheme="majorBidi"/>
+          <w:b/>
+          <w:bCs/>
+          <w:sz w:val="24"/>
+          <w:szCs w:val="24"/>
+        </w:rPr>
+        <w:lastRenderedPageBreak/>
+        <w:t>Audit Log –</w:t>
+      </w:r>
+      <w:r>
+        <w:rPr>
+          <w:rFonts w:asciiTheme="majorBidi" w:hAnsiTheme="majorBidi" w:cstheme="majorBidi"/>
+          <w:sz w:val="24"/>
+          <w:szCs w:val="24"/>
+        </w:rPr>
+        <w:t xml:space="preserve"> Historical record of administrative actions. </w:t>
+      </w:r>
+    </w:p>
+    <w:p>
+      <w:pPr>
+        <w:bidi w:val="0"/>
+        <w:spacing w:line="360" w:lineRule="auto"/>
+        <w:jc w:val="both"/>
+        <w:rPr>
+          <w:rFonts w:asciiTheme="majorBidi" w:hAnsiTheme="majorBidi" w:cstheme="majorBidi"/>
+          <w:sz w:val="24"/>
+          <w:szCs w:val="24"/>
+        </w:rPr>
+      </w:pPr>
+      <w:r>
+        <w:rPr>
+          <w:rFonts w:asciiTheme="majorBidi" w:hAnsiTheme="majorBidi" w:cstheme="majorBidi"/>
+          <w:b/>
+          <w:bCs/>
+          <w:sz w:val="24"/>
+          <w:szCs w:val="24"/>
+        </w:rPr>
+        <w:t>Payment Verification –</w:t>
+      </w:r>
+      <w:r>
+        <w:rPr>
+          <w:rFonts w:asciiTheme="majorBidi" w:hAnsiTheme="majorBidi" w:cstheme="majorBidi"/>
+          <w:sz w:val="24"/>
+          <w:szCs w:val="24"/>
+        </w:rPr>
+        <w:t xml:space="preserve"> Validation process for submitted payments. </w:t>
+      </w:r>
+    </w:p>
+    <w:p>
+      <w:pPr>
+        <w:bidi w:val="0"/>
+        <w:spacing w:line="360" w:lineRule="auto"/>
+        <w:jc w:val="both"/>
+        <w:rPr>
+          <w:rFonts w:asciiTheme="majorBidi" w:hAnsiTheme="majorBidi" w:cstheme="majorBidi"/>
+          <w:sz w:val="24"/>
+          <w:szCs w:val="24"/>
+        </w:rPr>
+      </w:pPr>
+      <w:r>
+        <w:rPr>
+          <w:rFonts w:asciiTheme="majorBidi" w:hAnsiTheme="majorBidi" w:cstheme="majorBidi"/>
+          <w:b/>
+          <w:bCs/>
+          <w:sz w:val="24"/>
+          <w:szCs w:val="24"/>
+        </w:rPr>
+        <w:t>Soft Delete –</w:t>
+      </w:r>
+      <w:r>
+        <w:rPr>
+          <w:rFonts w:asciiTheme="majorBidi" w:hAnsiTheme="majorBidi" w:cstheme="majorBidi"/>
+          <w:sz w:val="24"/>
+          <w:szCs w:val="24"/>
+        </w:rPr>
+        <w:t xml:space="preserve"> Data retention approach where records are marked deleted rather than permanently removed. </w:t>
+      </w:r>
+    </w:p>
+    <w:p>
+      <w:pPr>
+        <w:bidi w:val="0"/>
+        <w:spacing w:line="360" w:lineRule="auto"/>
+        <w:jc w:val="both"/>
+        <w:rPr>
+          <w:rFonts w:asciiTheme="majorBidi" w:hAnsiTheme="majorBidi" w:cstheme="majorBidi"/>
+          <w:sz w:val="24"/>
+          <w:szCs w:val="24"/>
+        </w:rPr>
+      </w:pPr>
+      <w:r>
+        <w:rPr>
+          <w:rFonts w:asciiTheme="majorBidi" w:hAnsiTheme="majorBidi" w:cstheme="majorBidi"/>
+          <w:b/>
+          <w:bCs/>
+          <w:sz w:val="24"/>
+          <w:szCs w:val="24"/>
+        </w:rPr>
+        <w:t>Role-Based Access Control (RBAC) –</w:t>
+      </w:r>
+      <w:r>
+        <w:rPr>
+          <w:rFonts w:asciiTheme="majorBidi" w:hAnsiTheme="majorBidi" w:cstheme="majorBidi"/>
+          <w:sz w:val="24"/>
+          <w:szCs w:val="24"/>
+        </w:rPr>
+        <w:t xml:space="preserve"> Permission model that restricts system access according to user roles. </w:t>
+      </w:r>
+    </w:p>
+    <w:p>
+      <w:pPr>
+        <w:bidi w:val="0"/>
+        <w:spacing w:line="360" w:lineRule="auto"/>
+        <w:jc w:val="both"/>
+        <w:rPr>
+          <w:rFonts w:asciiTheme="majorBidi" w:hAnsiTheme="majorBidi" w:cstheme="majorBidi"/>
+          <w:sz w:val="24"/>
+          <w:szCs w:val="24"/>
+        </w:rPr>
+      </w:pPr>
+      <w:r>
+        <w:rPr>
+          <w:rFonts w:asciiTheme="majorBidi" w:hAnsiTheme="majorBidi" w:cstheme="majorBidi"/>
+          <w:b/>
+          <w:bCs/>
+          <w:sz w:val="24"/>
+          <w:szCs w:val="24"/>
+        </w:rPr>
+        <w:t>Residential Management System (RMS) –</w:t>
+      </w:r>
+      <w:r>
+        <w:rPr>
+          <w:rFonts w:asciiTheme="majorBidi" w:hAnsiTheme="majorBidi" w:cstheme="majorBidi"/>
+          <w:sz w:val="24"/>
+          <w:szCs w:val="24"/>
+        </w:rPr>
+        <w:t xml:space="preserve"> Module for managing buildings, units, tenants, contracts, and payments.</w:t>
+      </w:r>
     </w:p>
     <w:p>
       <w:pPr>
@@ -5517,34 +7509,163 @@
           <w:bCs/>
         </w:rPr>
       </w:pPr>
-      <w:bookmarkStart w:id="15" w:name="_Toc228527521"/>
-      <w:r>
-        <w:rPr>
-          <w:b/>
-          <w:bCs/>
-        </w:rPr>
-        <w:t>2.1 Introduction</w:t>
-      </w:r>
-      <w:bookmarkEnd w:id="15"/>
-    </w:p>
-    <w:p>
-      <w:pPr>
-        <w:bidi w:val="0"/>
-        <w:spacing w:line="360" w:lineRule="auto"/>
-        <w:jc w:val="both"/>
-        <w:rPr>
-          <w:rFonts w:asciiTheme="majorBidi" w:hAnsiTheme="majorBidi" w:cstheme="majorBidi"/>
-          <w:sz w:val="24"/>
-          <w:szCs w:val="24"/>
-        </w:rPr>
-      </w:pPr>
-      <w:r>
-        <w:rPr>
-          <w:rFonts w:asciiTheme="majorBidi" w:hAnsiTheme="majorBidi" w:cstheme="majorBidi"/>
-          <w:sz w:val="24"/>
-          <w:szCs w:val="24"/>
-        </w:rPr>
-        <w:t>The literature review serves as a critical foundation for understanding the intersection of real estate management, web technologies, and automated management workflows. In recent years, the shift from traditional manual property management to digital ecosystems has accelerated, driven by the need for transparency, speed, and data security. This chapter explores existing studies on property technology (PropTech), evaluates the effectiveness of current real-time systems, and reviews the theories that govern user adoption of new software. By analyzing global and regional empirical evidence, this review identifies the specific gaps that the GuriGate system aims to address within the Somaliland real estate market.</w:t>
+      <w:bookmarkStart w:id="17" w:name="_Toc228527523"/>
+      <w:r>
+        <w:rPr>
+          <w:b/>
+          <w:bCs/>
+        </w:rPr>
+        <w:t>2.3 Empirical Literature</w:t>
+      </w:r>
+      <w:bookmarkEnd w:id="17"/>
+    </w:p>
+    <w:p>
+      <w:pPr>
+        <w:bidi w:val="0"/>
+        <w:spacing w:line="360" w:lineRule="auto"/>
+        <w:jc w:val="both"/>
+        <w:rPr>
+          <w:rFonts w:asciiTheme="majorBidi" w:hAnsiTheme="majorBidi" w:cstheme="majorBidi"/>
+          <w:sz w:val="24"/>
+          <w:szCs w:val="24"/>
+        </w:rPr>
+      </w:pPr>
+      <w:r>
+        <w:rPr>
+          <w:rFonts w:asciiTheme="majorBidi" w:hAnsiTheme="majorBidi" w:cstheme="majorBidi"/>
+          <w:sz w:val="24"/>
+          <w:szCs w:val="24"/>
+        </w:rPr>
+        <w:t>The digital transformation of the real estate industry has been a subject of intense academic scrutiny over the last five years. Globally, the adoption of PropTech has moved beyond simple listings to integrated management systems. In a comprehensive study on the digitalization of emerging markets, Akomea-Bonsu (2020) demonstrated that real-time web platforms increased the volume of rental transactions by 40% in urban centers by reducing the "search friction" traditionally associated with physical visits [1]. This research highlighted that the primary value of such systems lies in their ability to provide "digital trust" through verified listings.</w:t>
+      </w:r>
+    </w:p>
+    <w:p>
+      <w:pPr>
+        <w:bidi w:val="0"/>
+        <w:spacing w:line="360" w:lineRule="auto"/>
+        <w:jc w:val="both"/>
+        <w:rPr>
+          <w:rFonts w:asciiTheme="majorBidi" w:hAnsiTheme="majorBidi" w:cstheme="majorBidi"/>
+          <w:sz w:val="24"/>
+          <w:szCs w:val="24"/>
+        </w:rPr>
+      </w:pPr>
+      <w:r>
+        <w:rPr>
+          <w:rFonts w:asciiTheme="majorBidi" w:hAnsiTheme="majorBidi" w:cstheme="majorBidi"/>
+          <w:sz w:val="24"/>
+          <w:szCs w:val="24"/>
+        </w:rPr>
+        <w:t>The application of Algorithmic Filtering in property recommendation has significantly evolved. Das et al. (2024) explored the efficacy of advanced database queries in predicting user housing preferences [5]. Their findings suggested that algorithmic filters, which learn from a user’s previous clicks and location data, are 65% more likely to result in a successful rental agreement than static search bars. Furthermore, Patel (2022) argued that the integration of automation reduces the cognitive load on users, allowing them to navigate thousands of listings with ease by presenting only the most relevant options [12].</w:t>
+      </w:r>
+    </w:p>
+    <w:p>
+      <w:pPr>
+        <w:bidi w:val="0"/>
+        <w:spacing w:line="360" w:lineRule="auto"/>
+        <w:jc w:val="both"/>
+        <w:rPr>
+          <w:rFonts w:asciiTheme="majorBidi" w:hAnsiTheme="majorBidi" w:cstheme="majorBidi"/>
+          <w:sz w:val="24"/>
+          <w:szCs w:val="24"/>
+        </w:rPr>
+      </w:pPr>
+      <w:r>
+        <w:rPr>
+          <w:rFonts w:asciiTheme="majorBidi" w:hAnsiTheme="majorBidi" w:cstheme="majorBidi"/>
+          <w:sz w:val="24"/>
+          <w:szCs w:val="24"/>
+        </w:rPr>
+        <w:t xml:space="preserve">In the African context, the literature reveals a unique set of challenges and successes. Balogun et al. (2022) conducted an empirical analysis of smart property management in Nigeria, noting that while web adoption is high among younger demographics, the lack of secure payment gateways remains a barrier [3]. Their study emphasized that for a system to be successful in an African urban center, it must integrate local mobile money or secure banking APIs to facilitate rent payments. </w:t>
+      </w:r>
+      <w:r>
+        <w:rPr>
+          <w:rFonts w:asciiTheme="majorBidi" w:hAnsiTheme="majorBidi" w:cstheme="majorBidi"/>
+          <w:sz w:val="24"/>
+          <w:szCs w:val="24"/>
+        </w:rPr>
+        <w:lastRenderedPageBreak/>
+        <w:t>This is echoed by Mbata (2023), who reviewed the PropTech landscape in Kenya and found that systems offering "virtual galleries" saw a 50% reduction in the fraudulent collection of "viewing fees" [9].</w:t>
+      </w:r>
+    </w:p>
+    <w:p>
+      <w:pPr>
+        <w:bidi w:val="0"/>
+        <w:spacing w:line="360" w:lineRule="auto"/>
+        <w:jc w:val="both"/>
+        <w:rPr>
+          <w:rFonts w:asciiTheme="majorBidi" w:hAnsiTheme="majorBidi" w:cstheme="majorBidi"/>
+          <w:sz w:val="24"/>
+          <w:szCs w:val="24"/>
+        </w:rPr>
+      </w:pPr>
+      <w:r>
+        <w:rPr>
+          <w:rFonts w:asciiTheme="majorBidi" w:hAnsiTheme="majorBidi" w:cstheme="majorBidi"/>
+          <w:sz w:val="24"/>
+          <w:szCs w:val="24"/>
+        </w:rPr>
+        <w:t>The technical architecture of real estate platforms has also been a focal point of recent empirical research. Chen (2023) analyzed the performance of real-time data synchronization using WebSockets in property apps [4]. The study concluded that real-time attributes are essential for high-demand markets to prevent multiple users from attempting to book the same property simultaneously. Similarly, Saini (2021) demonstrated that using an MVC architecture in full-stack development ensures that the system remains scalable as the number of listings grows from hundreds to thousands [13].</w:t>
+      </w:r>
+    </w:p>
+    <w:p>
+      <w:pPr>
+        <w:bidi w:val="0"/>
+        <w:spacing w:line="360" w:lineRule="auto"/>
+        <w:jc w:val="both"/>
+        <w:rPr>
+          <w:rFonts w:asciiTheme="majorBidi" w:hAnsiTheme="majorBidi" w:cstheme="majorBidi"/>
+          <w:sz w:val="24"/>
+          <w:szCs w:val="24"/>
+        </w:rPr>
+      </w:pPr>
+      <w:r>
+        <w:rPr>
+          <w:rFonts w:asciiTheme="majorBidi" w:hAnsiTheme="majorBidi" w:cstheme="majorBidi"/>
+          <w:sz w:val="24"/>
+          <w:szCs w:val="24"/>
+        </w:rPr>
+        <w:t>Regional studies specifically targeting the Horn of Africa are fewer, but Ibrahim (2021) provided a critical look at the digitalization of services in Ethiopia and Somaliland [6]. The study identified that the "middleman culture" is the greatest obstacle to digital adoption. Ibrahim noted that traditional agents often resist digital platforms that offer price transparency. However, the study also found a growing appetite among the "diaspora" community for systems like GuriGate, which allow them to manage or rent properties in their home countries from abroad without relying on unreliable intermediaries [6].</w:t>
+      </w:r>
+    </w:p>
+    <w:p>
+      <w:pPr>
+        <w:bidi w:val="0"/>
+        <w:spacing w:line="360" w:lineRule="auto"/>
+        <w:jc w:val="both"/>
+        <w:rPr>
+          <w:rFonts w:asciiTheme="majorBidi" w:hAnsiTheme="majorBidi" w:cstheme="majorBidi"/>
+          <w:sz w:val="24"/>
+          <w:szCs w:val="24"/>
+        </w:rPr>
+      </w:pPr>
+      <w:r>
+        <w:rPr>
+          <w:rFonts w:asciiTheme="majorBidi" w:hAnsiTheme="majorBidi" w:cstheme="majorBidi"/>
+          <w:sz w:val="24"/>
+          <w:szCs w:val="24"/>
+        </w:rPr>
+        <w:t>Security and data privacy in real-time systems have also been addressed. Nwankwo (2020) investigated the vulnerabilities of African fintech and property applications, concluding that the use of advanced encryption (such as SHA-series) and multi-factor authentication is no longer optional due to the rise in identity theft within the real estate sector [10]. This empirical evidence supports GuriGate's decision to prioritize high-level cryptographic mechanisms.</w:t>
+      </w:r>
+    </w:p>
+    <w:p>
+      <w:pPr>
+        <w:bidi w:val="0"/>
+        <w:spacing w:line="360" w:lineRule="auto"/>
+        <w:jc w:val="both"/>
+        <w:rPr>
+          <w:rFonts w:asciiTheme="majorBidi" w:hAnsiTheme="majorBidi" w:cstheme="majorBidi"/>
+          <w:sz w:val="24"/>
+          <w:szCs w:val="24"/>
+        </w:rPr>
+      </w:pPr>
+      <w:r>
+        <w:rPr>
+          <w:rFonts w:asciiTheme="majorBidi" w:hAnsiTheme="majorBidi" w:cstheme="majorBidi"/>
+          <w:sz w:val="24"/>
+          <w:szCs w:val="24"/>
+        </w:rPr>
+        <w:t>Finally, the impact of UI/UX (User Interface/User Experience) on system retention was explored by Khalid (2022) [8]. The research found that in markets with varying levels of digital literacy, a "minimalist" design approach is superior. Systems that cluttered the interface with too much technical data saw a higher bounce rate compared to those that used intuitive icons and geolocation maps. This finding was instrumental in shaping the design of the GuriGate landing page and dashboard [8].</w:t>
       </w:r>
     </w:p>
     <w:p>
@@ -5557,184 +7678,156 @@
           <w:bCs/>
         </w:rPr>
       </w:pPr>
-      <w:bookmarkStart w:id="16" w:name="_Toc228527522"/>
-      <w:r>
-        <w:rPr>
-          <w:b/>
-          <w:bCs/>
-        </w:rPr>
-        <w:t>2.2 Related Terminologies</w:t>
-      </w:r>
-      <w:bookmarkEnd w:id="16"/>
-    </w:p>
-    <w:p>
-      <w:pPr>
-        <w:bidi w:val="0"/>
-        <w:spacing w:line="360" w:lineRule="auto"/>
-        <w:jc w:val="both"/>
-        <w:rPr>
-          <w:rFonts w:asciiTheme="majorBidi" w:hAnsiTheme="majorBidi" w:cstheme="majorBidi"/>
-          <w:sz w:val="24"/>
-          <w:szCs w:val="24"/>
-        </w:rPr>
-      </w:pPr>
-      <w:r>
-        <w:rPr>
-          <w:rFonts w:asciiTheme="majorBidi" w:hAnsiTheme="majorBidi" w:cstheme="majorBidi"/>
-          <w:sz w:val="24"/>
-          <w:szCs w:val="24"/>
-        </w:rPr>
-        <w:t>To provide a clear context for this research, the following technical and industry-specific terms are defined:</w:t>
-      </w:r>
-    </w:p>
-    <w:p>
-      <w:pPr>
-        <w:bidi w:val="0"/>
-        <w:spacing w:line="360" w:lineRule="auto"/>
-        <w:jc w:val="both"/>
-        <w:rPr>
-          <w:rFonts w:asciiTheme="majorBidi" w:hAnsiTheme="majorBidi" w:cstheme="majorBidi"/>
-          <w:sz w:val="24"/>
-          <w:szCs w:val="24"/>
-        </w:rPr>
-      </w:pPr>
-      <w:r>
-        <w:rPr>
-          <w:rFonts w:asciiTheme="majorBidi" w:hAnsiTheme="majorBidi" w:cstheme="majorBidi"/>
-          <w:b/>
-          <w:bCs/>
-          <w:sz w:val="24"/>
-          <w:szCs w:val="24"/>
-        </w:rPr>
-        <w:t>PropTech (Property Technology):</w:t>
-      </w:r>
-      <w:r>
-        <w:rPr>
-          <w:rFonts w:asciiTheme="majorBidi" w:hAnsiTheme="majorBidi" w:cstheme="majorBidi"/>
-          <w:sz w:val="24"/>
-          <w:szCs w:val="24"/>
-        </w:rPr>
-        <w:t xml:space="preserve"> A broad categorization of software and platforms designed to optimize how people buy, sell, rent, and manage property [1].</w:t>
-      </w:r>
-    </w:p>
-    <w:p>
-      <w:pPr>
-        <w:bidi w:val="0"/>
-        <w:spacing w:line="360" w:lineRule="auto"/>
-        <w:jc w:val="both"/>
-        <w:rPr>
-          <w:rFonts w:asciiTheme="majorBidi" w:hAnsiTheme="majorBidi" w:cstheme="majorBidi"/>
-          <w:sz w:val="24"/>
-          <w:szCs w:val="24"/>
-        </w:rPr>
-      </w:pPr>
-      <w:r>
-        <w:rPr>
-          <w:rFonts w:asciiTheme="majorBidi" w:hAnsiTheme="majorBidi" w:cstheme="majorBidi"/>
-          <w:b/>
-          <w:bCs/>
-          <w:sz w:val="24"/>
-          <w:szCs w:val="24"/>
-        </w:rPr>
-        <w:t>Real-Time System:</w:t>
-      </w:r>
-      <w:r>
-        <w:rPr>
-          <w:rFonts w:asciiTheme="majorBidi" w:hAnsiTheme="majorBidi" w:cstheme="majorBidi"/>
-          <w:sz w:val="24"/>
-          <w:szCs w:val="24"/>
-        </w:rPr>
-        <w:t xml:space="preserve"> In the context of this study, it refers to a web architecture where data updates (such as a property becoming "unavailable") are reflected across all user interfaces instantaneously without manual refreshing [4].</w:t>
-      </w:r>
-    </w:p>
-    <w:p>
-      <w:pPr>
-        <w:bidi w:val="0"/>
-        <w:spacing w:line="360" w:lineRule="auto"/>
-        <w:jc w:val="both"/>
-        <w:rPr>
-          <w:rFonts w:asciiTheme="majorBidi" w:hAnsiTheme="majorBidi" w:cstheme="majorBidi"/>
-          <w:sz w:val="24"/>
-          <w:szCs w:val="24"/>
-        </w:rPr>
-      </w:pPr>
-      <w:r>
-        <w:rPr>
-          <w:rFonts w:asciiTheme="majorBidi" w:hAnsiTheme="majorBidi" w:cstheme="majorBidi"/>
-          <w:b/>
-          <w:bCs/>
-          <w:sz w:val="24"/>
-          <w:szCs w:val="24"/>
-        </w:rPr>
-        <w:t>Database-driven Logic Engine:</w:t>
-      </w:r>
-      <w:r>
-        <w:rPr>
-          <w:rFonts w:asciiTheme="majorBidi" w:hAnsiTheme="majorBidi" w:cstheme="majorBidi"/>
-          <w:sz w:val="24"/>
-          <w:szCs w:val="24"/>
-        </w:rPr>
-        <w:t xml:space="preserve"> A component of the system that applies logical rules to a knowledge base (user data and property attributes) to provide personalized recommendations [5].</w:t>
-      </w:r>
-    </w:p>
-    <w:p>
-      <w:pPr>
-        <w:bidi w:val="0"/>
-        <w:spacing w:line="360" w:lineRule="auto"/>
-        <w:jc w:val="both"/>
-        <w:rPr>
-          <w:rFonts w:asciiTheme="majorBidi" w:hAnsiTheme="majorBidi" w:cstheme="majorBidi"/>
-          <w:sz w:val="24"/>
-          <w:szCs w:val="24"/>
-        </w:rPr>
-      </w:pPr>
-      <w:r>
-        <w:rPr>
-          <w:rFonts w:asciiTheme="majorBidi" w:hAnsiTheme="majorBidi" w:cstheme="majorBidi"/>
-          <w:b/>
-          <w:bCs/>
-          <w:sz w:val="24"/>
-          <w:szCs w:val="24"/>
-        </w:rPr>
-        <w:t>MVC (Model-View-Controller):</w:t>
-      </w:r>
-      <w:r>
-        <w:rPr>
-          <w:rFonts w:asciiTheme="majorBidi" w:hAnsiTheme="majorBidi" w:cstheme="majorBidi"/>
-          <w:sz w:val="24"/>
-          <w:szCs w:val="24"/>
-        </w:rPr>
-        <w:t xml:space="preserve"> A software architectural pattern used to separate the internal representation of information from the ways information is presented to and accepted from the user [13].</w:t>
-      </w:r>
-    </w:p>
-    <w:p>
-      <w:pPr>
-        <w:bidi w:val="0"/>
-        <w:spacing w:line="360" w:lineRule="auto"/>
-        <w:jc w:val="both"/>
-        <w:rPr>
-          <w:rFonts w:asciiTheme="majorBidi" w:hAnsiTheme="majorBidi" w:cstheme="majorBidi"/>
-          <w:sz w:val="24"/>
-          <w:szCs w:val="24"/>
-        </w:rPr>
-      </w:pPr>
-      <w:r>
-        <w:rPr>
-          <w:rFonts w:asciiTheme="majorBidi" w:hAnsiTheme="majorBidi" w:cstheme="majorBidi"/>
-          <w:b/>
-          <w:bCs/>
-          <w:sz w:val="24"/>
-          <w:szCs w:val="24"/>
-        </w:rPr>
-        <w:t>Informational Asymmetry:</w:t>
-      </w:r>
-      <w:r>
-        <w:rPr>
-          <w:rFonts w:asciiTheme="majorBidi" w:hAnsiTheme="majorBidi" w:cstheme="majorBidi"/>
-          <w:sz w:val="24"/>
-          <w:szCs w:val="24"/>
-        </w:rPr>
-        <w:t xml:space="preserve"> A situation in the real estate market where one party (usually the agent/owner) has more or better information than the other (the seeker), often leading to exploitation [11].</w:t>
+      <w:bookmarkStart w:id="18" w:name="_Toc228527524"/>
+      <w:r>
+        <w:rPr>
+          <w:b/>
+          <w:bCs/>
+        </w:rPr>
+        <w:lastRenderedPageBreak/>
+        <w:t>2.4 Theoretical Review</w:t>
+      </w:r>
+      <w:bookmarkEnd w:id="18"/>
+    </w:p>
+    <w:p>
+      <w:pPr>
+        <w:bidi w:val="0"/>
+        <w:spacing w:line="360" w:lineRule="auto"/>
+        <w:jc w:val="both"/>
+        <w:rPr>
+          <w:rFonts w:asciiTheme="majorBidi" w:hAnsiTheme="majorBidi" w:cstheme="majorBidi"/>
+          <w:sz w:val="24"/>
+          <w:szCs w:val="24"/>
+        </w:rPr>
+      </w:pPr>
+      <w:r>
+        <w:rPr>
+          <w:rFonts w:asciiTheme="majorBidi" w:hAnsiTheme="majorBidi" w:cstheme="majorBidi"/>
+          <w:sz w:val="24"/>
+          <w:szCs w:val="24"/>
+        </w:rPr>
+        <w:t>This research is underpinned by three primary theories: the Technology Acceptance Model (TAM), the Diffusion of Innovation Theory (DOI), and the Agency Theory.</w:t>
+      </w:r>
+    </w:p>
+    <w:p>
+      <w:pPr>
+        <w:pStyle w:val="Heading3"/>
+        <w:bidi w:val="0"/>
+        <w:spacing w:line="360" w:lineRule="auto"/>
+        <w:rPr>
+          <w:b/>
+          <w:bCs/>
+        </w:rPr>
+      </w:pPr>
+      <w:bookmarkStart w:id="19" w:name="_Toc228527525"/>
+      <w:r>
+        <w:rPr>
+          <w:b/>
+          <w:bCs/>
+        </w:rPr>
+        <w:t>2.4.1 Technology Acceptance Model (TAM)</w:t>
+      </w:r>
+      <w:bookmarkEnd w:id="19"/>
+    </w:p>
+    <w:p>
+      <w:pPr>
+        <w:bidi w:val="0"/>
+        <w:spacing w:line="360" w:lineRule="auto"/>
+        <w:jc w:val="both"/>
+        <w:rPr>
+          <w:rFonts w:asciiTheme="majorBidi" w:hAnsiTheme="majorBidi" w:cstheme="majorBidi"/>
+          <w:sz w:val="24"/>
+          <w:szCs w:val="24"/>
+        </w:rPr>
+      </w:pPr>
+      <w:r>
+        <w:rPr>
+          <w:rFonts w:asciiTheme="majorBidi" w:hAnsiTheme="majorBidi" w:cstheme="majorBidi"/>
+          <w:sz w:val="24"/>
+          <w:szCs w:val="24"/>
+        </w:rPr>
+        <w:t>Originally proposed by Davis, TAM remains the most influential theory in explaining user behavior toward new software. Tetteh (2022) applied TAM to real estate software, arguing that "Perceived Usefulness" and "Perceived Ease of Use" are the two critical determinants of whether a landlord will migrate from paper ledgers to a digital system [14]. GuriGate was designed with this in mind, ensuring the dashboard is intuitive (Ease of Use) and provides clear financial summaries (Usefulness).</w:t>
+      </w:r>
+    </w:p>
+    <w:p>
+      <w:pPr>
+        <w:pStyle w:val="Heading3"/>
+        <w:bidi w:val="0"/>
+        <w:spacing w:line="360" w:lineRule="auto"/>
+        <w:rPr>
+          <w:b/>
+          <w:bCs/>
+        </w:rPr>
+      </w:pPr>
+      <w:bookmarkStart w:id="20" w:name="_Toc228527526"/>
+      <w:r>
+        <w:rPr>
+          <w:b/>
+          <w:bCs/>
+        </w:rPr>
+        <w:t>2.4.2 Diffusion of Innovation Theory (DOI)</w:t>
+      </w:r>
+      <w:bookmarkEnd w:id="20"/>
+    </w:p>
+    <w:p>
+      <w:pPr>
+        <w:bidi w:val="0"/>
+        <w:spacing w:line="360" w:lineRule="auto"/>
+        <w:jc w:val="both"/>
+        <w:rPr>
+          <w:rFonts w:asciiTheme="majorBidi" w:hAnsiTheme="majorBidi" w:cstheme="majorBidi"/>
+          <w:sz w:val="24"/>
+          <w:szCs w:val="24"/>
+          <w:rtl/>
+        </w:rPr>
+      </w:pPr>
+      <w:r>
+        <w:rPr>
+          <w:rFonts w:asciiTheme="majorBidi" w:hAnsiTheme="majorBidi" w:cstheme="majorBidi"/>
+          <w:sz w:val="24"/>
+          <w:szCs w:val="24"/>
+        </w:rPr>
+        <w:t>Rogers' DOI theory explains how, why, and at what rate new ideas and technology spread. In the context of GuriGate, this theory helps explain the "early adopter" phase in Somaliland. According to Zhang (2025), the "Relative Advantage" of a digital system over a manual one must be immediately visible to overcome the status quo [16]. GuriGate provides this advantage through real-time notifications and algorithmic recommendations, which are innovations not currently present in the traditional Somaliland market.</w:t>
+      </w:r>
+    </w:p>
+    <w:p>
+      <w:pPr>
+        <w:pStyle w:val="Heading3"/>
+        <w:bidi w:val="0"/>
+        <w:spacing w:line="360" w:lineRule="auto"/>
+        <w:rPr>
+          <w:b/>
+          <w:bCs/>
+        </w:rPr>
+      </w:pPr>
+      <w:bookmarkStart w:id="21" w:name="_Toc228527527"/>
+      <w:r>
+        <w:rPr>
+          <w:b/>
+          <w:bCs/>
+        </w:rPr>
+        <w:t>2.4.3 Agency Theory</w:t>
+      </w:r>
+      <w:bookmarkEnd w:id="21"/>
+    </w:p>
+    <w:p>
+      <w:pPr>
+        <w:bidi w:val="0"/>
+        <w:spacing w:line="360" w:lineRule="auto"/>
+        <w:jc w:val="both"/>
+        <w:rPr>
+          <w:rFonts w:asciiTheme="majorBidi" w:hAnsiTheme="majorBidi" w:cstheme="majorBidi"/>
+          <w:sz w:val="24"/>
+          <w:szCs w:val="24"/>
+        </w:rPr>
+      </w:pPr>
+      <w:r>
+        <w:rPr>
+          <w:rFonts w:asciiTheme="majorBidi" w:hAnsiTheme="majorBidi" w:cstheme="majorBidi"/>
+          <w:sz w:val="24"/>
+          <w:szCs w:val="24"/>
+        </w:rPr>
+        <w:t>Agency Theory deals with the relationship between principals (landlords) and agents (property managers or tenants). Okafor (2024) utilized this theory to explain the "Moral Hazard" in real estate, where agents may hide information for their own benefit [11]. GuriGate acts as a "technological monitor," reducing the information gap and ensuring that the principal has direct, real-time access to payment statuses and property conditions, thereby minimizing agency costs.</w:t>
       </w:r>
     </w:p>
     <w:p>
@@ -5747,108 +7840,236 @@
           <w:bCs/>
         </w:rPr>
       </w:pPr>
-      <w:bookmarkStart w:id="17" w:name="_Toc228527523"/>
-      <w:r>
-        <w:rPr>
-          <w:b/>
-          <w:bCs/>
+      <w:bookmarkStart w:id="22" w:name="_Toc228527528"/>
+      <w:r>
+        <w:rPr>
+          <w:b/>
+          <w:bCs/>
+        </w:rPr>
+        <w:t>2.5 Research Gap</w:t>
+      </w:r>
+      <w:bookmarkEnd w:id="22"/>
+    </w:p>
+    <w:p>
+      <w:pPr>
+        <w:bidi w:val="0"/>
+        <w:spacing w:line="360" w:lineRule="auto"/>
+        <w:jc w:val="both"/>
+        <w:rPr>
+          <w:rFonts w:asciiTheme="majorBidi" w:hAnsiTheme="majorBidi" w:cstheme="majorBidi"/>
+          <w:sz w:val="24"/>
+          <w:szCs w:val="24"/>
+        </w:rPr>
+      </w:pPr>
+      <w:r>
+        <w:rPr>
+          <w:rFonts w:asciiTheme="majorBidi" w:hAnsiTheme="majorBidi" w:cstheme="majorBidi"/>
+          <w:sz w:val="24"/>
+          <w:szCs w:val="24"/>
+        </w:rPr>
+        <w:t>Despite the proliferation of property systems globally, a specific gap exists in the Somaliland context. Existing literature focuses on developed markets or large African hubs like Lagos and Nairobi, often ignoring the unique socioeconomic and "middleman-heavy" structure of Hargeisa.</w:t>
+      </w:r>
+    </w:p>
+    <w:p>
+      <w:pPr>
+        <w:bidi w:val="0"/>
+        <w:spacing w:line="360" w:lineRule="auto"/>
+        <w:jc w:val="both"/>
+        <w:rPr>
+          <w:rFonts w:asciiTheme="majorBidi" w:hAnsiTheme="majorBidi" w:cstheme="majorBidi"/>
+          <w:sz w:val="24"/>
+          <w:szCs w:val="24"/>
+        </w:rPr>
+      </w:pPr>
+      <w:r>
+        <w:rPr>
+          <w:rFonts w:asciiTheme="majorBidi" w:hAnsiTheme="majorBidi" w:cstheme="majorBidi"/>
+          <w:sz w:val="24"/>
+          <w:szCs w:val="24"/>
         </w:rPr>
         <w:lastRenderedPageBreak/>
-        <w:t>2.3 Empirical Literature</w:t>
-      </w:r>
-      <w:bookmarkEnd w:id="17"/>
-    </w:p>
-    <w:p>
-      <w:pPr>
-        <w:bidi w:val="0"/>
-        <w:spacing w:line="360" w:lineRule="auto"/>
-        <w:jc w:val="both"/>
-        <w:rPr>
-          <w:rFonts w:asciiTheme="majorBidi" w:hAnsiTheme="majorBidi" w:cstheme="majorBidi"/>
-          <w:sz w:val="24"/>
-          <w:szCs w:val="24"/>
-        </w:rPr>
-      </w:pPr>
-      <w:r>
-        <w:rPr>
-          <w:rFonts w:asciiTheme="majorBidi" w:hAnsiTheme="majorBidi" w:cstheme="majorBidi"/>
-          <w:sz w:val="24"/>
-          <w:szCs w:val="24"/>
-        </w:rPr>
-        <w:t>The digital transformation of the real estate industry has been a subject of intense academic scrutiny over the last five years. Globally, the adoption of PropTech has moved beyond simple listings to integrated management systems. In a comprehensive study on the digitalization of emerging markets, Akomea-Bonsu (2020) demonstrated that real-time web platforms increased the volume of rental transactions by 40% in urban centers by reducing the "search friction" traditionally associated with physical visits [1]. This research highlighted that the primary value of such systems lies in their ability to provide "digital trust" through verified listings.</w:t>
-      </w:r>
-    </w:p>
-    <w:p>
-      <w:pPr>
-        <w:bidi w:val="0"/>
-        <w:spacing w:line="360" w:lineRule="auto"/>
-        <w:jc w:val="both"/>
-        <w:rPr>
-          <w:rFonts w:asciiTheme="majorBidi" w:hAnsiTheme="majorBidi" w:cstheme="majorBidi"/>
-          <w:sz w:val="24"/>
-          <w:szCs w:val="24"/>
-        </w:rPr>
-      </w:pPr>
-      <w:r>
-        <w:rPr>
-          <w:rFonts w:asciiTheme="majorBidi" w:hAnsiTheme="majorBidi" w:cstheme="majorBidi"/>
-          <w:sz w:val="24"/>
-          <w:szCs w:val="24"/>
-        </w:rPr>
-        <w:t>The application of Algorithmic Filtering in property recommendation has significantly evolved. Das et al. (2024) explored the efficacy of advanced database queries in predicting user housing preferences [5]. Their findings suggested that algorithmic filters, which learn from a user’s previous clicks and location data, are 65% more likely to result in a successful rental agreement than static search bars. Furthermore, Patel (2022) argued that the integration of automation reduces the cognitive load on users, allowing them to navigate thousands of listings with ease by presenting only the most relevant options [12].</w:t>
-      </w:r>
-    </w:p>
-    <w:p>
-      <w:pPr>
-        <w:bidi w:val="0"/>
-        <w:spacing w:line="360" w:lineRule="auto"/>
-        <w:jc w:val="both"/>
-        <w:rPr>
-          <w:rFonts w:asciiTheme="majorBidi" w:hAnsiTheme="majorBidi" w:cstheme="majorBidi"/>
-          <w:sz w:val="24"/>
-          <w:szCs w:val="24"/>
-        </w:rPr>
-      </w:pPr>
-      <w:r>
-        <w:rPr>
-          <w:rFonts w:asciiTheme="majorBidi" w:hAnsiTheme="majorBidi" w:cstheme="majorBidi"/>
-          <w:sz w:val="24"/>
-          <w:szCs w:val="24"/>
-        </w:rPr>
-        <w:t>In the African context, the literature reveals a unique set of challenges and successes. Balogun et al. (2022) conducted an empirical analysis of smart property management in Nigeria, noting that while web adoption is high among younger demographics, the lack of secure payment gateways remains a barrier [3]. Their study emphasized that for a system to be successful in an African urban center, it must integrate local mobile money or secure banking APIs to facilitate rent payments. This is echoed by Mbata (2023), who reviewed the PropTech landscape in Kenya and found that systems offering "virtual galleries" saw a 50% reduction in the fraudulent collection of "viewing fees" [9].</w:t>
-      </w:r>
-    </w:p>
-    <w:p>
-      <w:pPr>
-        <w:bidi w:val="0"/>
-        <w:spacing w:line="360" w:lineRule="auto"/>
-        <w:jc w:val="both"/>
-        <w:rPr>
-          <w:rFonts w:asciiTheme="majorBidi" w:hAnsiTheme="majorBidi" w:cstheme="majorBidi"/>
-          <w:sz w:val="24"/>
-          <w:szCs w:val="24"/>
-        </w:rPr>
-      </w:pPr>
-      <w:r>
-        <w:rPr>
-          <w:rFonts w:asciiTheme="majorBidi" w:hAnsiTheme="majorBidi" w:cstheme="majorBidi"/>
-          <w:sz w:val="24"/>
-          <w:szCs w:val="24"/>
-        </w:rPr>
-        <w:t>The technical architecture of real estate platforms has also been a focal point of recent empirical research. Chen (2023) analyzed the performance of real-time data synchronization using WebSockets in property apps [4]. The study concluded that real-time attributes are essential for high-demand markets to prevent multiple users from attempting to book the same property simultaneously. Similarly, Saini (2021) demonstrated that using an MVC architecture in full-stack development ensures that the system remains scalable as the number of listings grows from hundreds to thousands [13].</w:t>
-      </w:r>
-    </w:p>
-    <w:p>
-      <w:pPr>
-        <w:bidi w:val="0"/>
-        <w:spacing w:line="360" w:lineRule="auto"/>
-        <w:jc w:val="both"/>
-        <w:rPr>
-          <w:rFonts w:asciiTheme="majorBidi" w:hAnsiTheme="majorBidi" w:cstheme="majorBidi"/>
-          <w:sz w:val="24"/>
-          <w:szCs w:val="24"/>
-        </w:rPr>
-      </w:pPr>
+        <w:t>Identification of the Gap: There is a lack of a localized, real-time management system that integrates Algorithmic Filtering for personalized recommendations while adhering to the specific cultural and documentational requirements of Somaliland.</w:t>
+      </w:r>
+    </w:p>
+    <w:p>
+      <w:pPr>
+        <w:bidi w:val="0"/>
+        <w:spacing w:line="360" w:lineRule="auto"/>
+        <w:jc w:val="both"/>
+        <w:rPr>
+          <w:rFonts w:asciiTheme="majorBidi" w:hAnsiTheme="majorBidi" w:cstheme="majorBidi"/>
+          <w:sz w:val="24"/>
+          <w:szCs w:val="24"/>
+        </w:rPr>
+      </w:pPr>
+      <w:r>
+        <w:rPr>
+          <w:rFonts w:asciiTheme="majorBidi" w:hAnsiTheme="majorBidi" w:cstheme="majorBidi"/>
+          <w:sz w:val="24"/>
+          <w:szCs w:val="24"/>
+        </w:rPr>
+        <w:t>Consequences of the Gap: This has resulted in continued informational asymmetry, the persistence of "inspection fee" fraud, and a lack of trust among the diaspora looking to invest in local property.</w:t>
+      </w:r>
+    </w:p>
+    <w:p>
+      <w:pPr>
+        <w:bidi w:val="0"/>
+        <w:spacing w:line="360" w:lineRule="auto"/>
+        <w:jc w:val="both"/>
+        <w:rPr>
+          <w:rFonts w:asciiTheme="majorBidi" w:hAnsiTheme="majorBidi" w:cstheme="majorBidi"/>
+          <w:sz w:val="24"/>
+          <w:szCs w:val="24"/>
+        </w:rPr>
+      </w:pPr>
+      <w:r>
+        <w:rPr>
+          <w:rFonts w:asciiTheme="majorBidi" w:hAnsiTheme="majorBidi" w:cstheme="majorBidi"/>
+          <w:sz w:val="24"/>
+          <w:szCs w:val="24"/>
+        </w:rPr>
+        <w:t>Anticipated Benefits: By filling this gap, GuriGate provides a secure, transparent, and intelligent platform that empowers the user, reduces transaction costs, and professionalizes the local real estate industry.</w:t>
+      </w:r>
+    </w:p>
+    <w:p>
+      <w:pPr>
+        <w:pStyle w:val="Heading1"/>
+        <w:bidi w:val="0"/>
+        <w:spacing w:line="360" w:lineRule="auto"/>
+        <w:rPr>
+          <w:b/>
+          <w:bCs/>
+        </w:rPr>
+      </w:pPr>
+      <w:bookmarkStart w:id="23" w:name="_Toc228527529"/>
+      <w:r>
+        <w:rPr>
+          <w:b/>
+          <w:bCs/>
+        </w:rPr>
+        <w:t>CHAPTER THREE: METHODOLOGY</w:t>
+      </w:r>
+      <w:bookmarkEnd w:id="23"/>
+    </w:p>
+    <w:p>
+      <w:pPr>
+        <w:pStyle w:val="Heading2"/>
+        <w:bidi w:val="0"/>
+        <w:spacing w:line="360" w:lineRule="auto"/>
+        <w:rPr>
+          <w:b/>
+          <w:bCs/>
+        </w:rPr>
+      </w:pPr>
+      <w:bookmarkStart w:id="24" w:name="_Toc228527530"/>
+      <w:r>
+        <w:rPr>
+          <w:b/>
+          <w:bCs/>
+        </w:rPr>
+        <w:t>3.0 Introduction</w:t>
+      </w:r>
+      <w:bookmarkEnd w:id="24"/>
+    </w:p>
+    <w:p>
+      <w:pPr>
+        <w:bidi w:val="0"/>
+        <w:spacing w:line="360" w:lineRule="auto"/>
+        <w:jc w:val="both"/>
+        <w:rPr>
+          <w:rFonts w:asciiTheme="majorBidi" w:hAnsiTheme="majorBidi" w:cstheme="majorBidi"/>
+          <w:sz w:val="24"/>
+          <w:szCs w:val="24"/>
+        </w:rPr>
+      </w:pPr>
+      <w:r>
+        <w:rPr>
+          <w:rFonts w:asciiTheme="majorBidi" w:hAnsiTheme="majorBidi" w:cstheme="majorBidi"/>
+          <w:sz w:val="24"/>
+          <w:szCs w:val="24"/>
+        </w:rPr>
+        <w:t>This chapter outlines the systematic approach used to develop the GuriGate property management system. It details the research design, the methods used for data collection, the technical requirements, and the various modeling diagrams that guided the system’s development. The methodology was structured to ensure that the final system was not only technically sound but also aligned with the specific socio-economic needs of the real estate market in Hargeisa, Somaliland.</w:t>
+      </w:r>
+    </w:p>
+    <w:p>
+      <w:pPr>
+        <w:pStyle w:val="Heading2"/>
+        <w:bidi w:val="0"/>
+        <w:spacing w:line="360" w:lineRule="auto"/>
+        <w:rPr>
+          <w:b/>
+          <w:bCs/>
+        </w:rPr>
+      </w:pPr>
+      <w:bookmarkStart w:id="25" w:name="_Toc228527531"/>
+      <w:r>
+        <w:rPr>
+          <w:b/>
+          <w:bCs/>
+        </w:rPr>
+        <w:t>3.1 Technology and Methods Preview</w:t>
+      </w:r>
+      <w:bookmarkEnd w:id="25"/>
+    </w:p>
+    <w:p>
+      <w:pPr>
+        <w:bidi w:val="0"/>
+        <w:spacing w:line="360" w:lineRule="auto"/>
+        <w:jc w:val="both"/>
+        <w:rPr>
+          <w:rFonts w:asciiTheme="majorBidi" w:hAnsiTheme="majorBidi" w:cstheme="majorBidi"/>
+          <w:sz w:val="24"/>
+          <w:szCs w:val="24"/>
+        </w:rPr>
+      </w:pPr>
+      <w:r>
+        <w:rPr>
+          <w:rFonts w:asciiTheme="majorBidi" w:hAnsiTheme="majorBidi" w:cstheme="majorBidi"/>
+          <w:sz w:val="24"/>
+          <w:szCs w:val="24"/>
+        </w:rPr>
+        <w:t>The development of GuriGate utilized a combination of modern web technologies and automated workflow concepts. For the front-end, ReactJS and NextJS were selected to ensure a responsive and high-performance user interface. The back-end was powered by Node.js and Supabase (PostgreSQL) served as the data management system. The methodology integrated automated property analysis through a decision-tree engine to facilitate property recommendations. The development process followed an incremental approach, allowing for continuous testing and refinement of features.</w:t>
+      </w:r>
+    </w:p>
+    <w:p>
+      <w:pPr>
+        <w:pStyle w:val="Heading2"/>
+        <w:bidi w:val="0"/>
+        <w:spacing w:line="360" w:lineRule="auto"/>
+        <w:rPr>
+          <w:b/>
+          <w:bCs/>
+        </w:rPr>
+      </w:pPr>
+      <w:bookmarkStart w:id="26" w:name="_Toc228527532"/>
+      <w:r>
+        <w:rPr>
+          <w:b/>
+          <w:bCs/>
+        </w:rPr>
+        <w:t>3.2 Research Area</w:t>
+      </w:r>
+      <w:bookmarkEnd w:id="26"/>
+    </w:p>
+    <w:p>
+      <w:pPr>
+        <w:bidi w:val="0"/>
+        <w:spacing w:line="360" w:lineRule="auto"/>
+        <w:jc w:val="both"/>
+        <w:rPr>
+          <w:rFonts w:asciiTheme="majorBidi" w:hAnsiTheme="majorBidi" w:cstheme="majorBidi"/>
+          <w:sz w:val="24"/>
+          <w:szCs w:val="24"/>
+        </w:rPr>
+      </w:pPr>
+      <w:r>
+        <w:rPr>
+          <w:rFonts w:asciiTheme="majorBidi" w:hAnsiTheme="majorBidi" w:cstheme="majorBidi"/>
+          <w:sz w:val="24"/>
+          <w:szCs w:val="24"/>
+        </w:rPr>
+        <w:t xml:space="preserve">The research area for this study was Hargeisa, Somaliland. As the fastest-growing urban center in the region, Hargeisa provided a rich environment for studying the challenges of traditional property management. The study focused on the major commercial and residential districts where real estate activity is most concentrated. This geographical focus allowed the researcher to capture </w:t>
+      </w:r>
       <w:r>
         <w:rPr>
           <w:rFonts w:asciiTheme="majorBidi" w:hAnsiTheme="majorBidi" w:cstheme="majorBidi"/>
@@ -5856,47 +8077,7 @@
           <w:szCs w:val="24"/>
         </w:rPr>
         <w:lastRenderedPageBreak/>
-        <w:t>Regional studies specifically targeting the Horn of Africa are fewer, but Ibrahim (2021) provided a critical look at the digitalization of services in Ethiopia and Somaliland [6]. The study identified that the "middleman culture" is the greatest obstacle to digital adoption. Ibrahim noted that traditional agents often resist digital platforms that offer price transparency. However, the study also found a growing appetite among the "diaspora" community for systems like GuriGate, which allow them to manage or rent properties in their home countries from abroad without relying on unreliable intermediaries [6].</w:t>
-      </w:r>
-    </w:p>
-    <w:p>
-      <w:pPr>
-        <w:bidi w:val="0"/>
-        <w:spacing w:line="360" w:lineRule="auto"/>
-        <w:jc w:val="both"/>
-        <w:rPr>
-          <w:rFonts w:asciiTheme="majorBidi" w:hAnsiTheme="majorBidi" w:cstheme="majorBidi"/>
-          <w:sz w:val="24"/>
-          <w:szCs w:val="24"/>
-        </w:rPr>
-      </w:pPr>
-      <w:r>
-        <w:rPr>
-          <w:rFonts w:asciiTheme="majorBidi" w:hAnsiTheme="majorBidi" w:cstheme="majorBidi"/>
-          <w:sz w:val="24"/>
-          <w:szCs w:val="24"/>
-        </w:rPr>
-        <w:t>Security and data privacy in real-time systems have also been addressed. Nwankwo (2020) investigated the vulnerabilities of African fintech and property applications, concluding that the use of advanced encryption (such as SHA-series) and multi-factor authentication is no longer optional due to the rise in identity theft within the real estate sector [10]. This empirical evidence supports GuriGate's decision to prioritize high-level cryptographic mechanisms.</w:t>
-      </w:r>
-    </w:p>
-    <w:p>
-      <w:pPr>
-        <w:bidi w:val="0"/>
-        <w:spacing w:line="360" w:lineRule="auto"/>
-        <w:jc w:val="both"/>
-        <w:rPr>
-          <w:rFonts w:asciiTheme="majorBidi" w:hAnsiTheme="majorBidi" w:cstheme="majorBidi"/>
-          <w:sz w:val="24"/>
-          <w:szCs w:val="24"/>
-        </w:rPr>
-      </w:pPr>
-      <w:r>
-        <w:rPr>
-          <w:rFonts w:asciiTheme="majorBidi" w:hAnsiTheme="majorBidi" w:cstheme="majorBidi"/>
-          <w:sz w:val="24"/>
-          <w:szCs w:val="24"/>
-        </w:rPr>
-        <w:t>Finally, the impact of UI/UX (User Interface/User Experience) on system retention was explored by Khalid (2022) [8]. The research found that in markets with varying levels of digital literacy, a "minimalist" design approach is superior. Systems that cluttered the interface with too much technical data saw a higher bounce rate compared to those that used intuitive icons and geolocation maps. This finding was instrumental in shaping the design of the GuriGate landing page and dashboard [8].</w:t>
+        <w:t>the requirements of a diverse group of stakeholders, including local landlords, real estate agents, and members of the diaspora.</w:t>
       </w:r>
     </w:p>
     <w:p>
@@ -5909,649 +8090,246 @@
           <w:bCs/>
         </w:rPr>
       </w:pPr>
-      <w:bookmarkStart w:id="18" w:name="_Toc228527524"/>
-      <w:r>
-        <w:rPr>
-          <w:b/>
-          <w:bCs/>
-        </w:rPr>
-        <w:t>2.4 Theoretical Review</w:t>
-      </w:r>
-      <w:bookmarkEnd w:id="18"/>
-    </w:p>
-    <w:p>
-      <w:pPr>
-        <w:bidi w:val="0"/>
-        <w:spacing w:line="360" w:lineRule="auto"/>
-        <w:jc w:val="both"/>
-        <w:rPr>
-          <w:rFonts w:asciiTheme="majorBidi" w:hAnsiTheme="majorBidi" w:cstheme="majorBidi"/>
-          <w:sz w:val="24"/>
-          <w:szCs w:val="24"/>
-        </w:rPr>
-      </w:pPr>
-      <w:r>
-        <w:rPr>
-          <w:rFonts w:asciiTheme="majorBidi" w:hAnsiTheme="majorBidi" w:cstheme="majorBidi"/>
-          <w:sz w:val="24"/>
-          <w:szCs w:val="24"/>
-        </w:rPr>
-        <w:t>This research is underpinned by three primary theories: the Technology Acceptance Model (TAM), the Diffusion of Innovation Theory (DOI), and the Agency Theory.</w:t>
-      </w:r>
-    </w:p>
-    <w:p>
-      <w:pPr>
-        <w:pStyle w:val="Heading3"/>
-        <w:bidi w:val="0"/>
-        <w:spacing w:line="360" w:lineRule="auto"/>
-        <w:rPr>
-          <w:b/>
-          <w:bCs/>
-        </w:rPr>
-      </w:pPr>
-      <w:bookmarkStart w:id="19" w:name="_Toc228527525"/>
-      <w:r>
-        <w:rPr>
-          <w:b/>
-          <w:bCs/>
-        </w:rPr>
-        <w:t>2.4.1 Technology Acceptance Model (TAM)</w:t>
-      </w:r>
-      <w:bookmarkEnd w:id="19"/>
-    </w:p>
-    <w:p>
-      <w:pPr>
-        <w:bidi w:val="0"/>
-        <w:spacing w:line="360" w:lineRule="auto"/>
-        <w:jc w:val="both"/>
-        <w:rPr>
-          <w:rFonts w:asciiTheme="majorBidi" w:hAnsiTheme="majorBidi" w:cstheme="majorBidi"/>
-          <w:sz w:val="24"/>
-          <w:szCs w:val="24"/>
-        </w:rPr>
-      </w:pPr>
-      <w:r>
-        <w:rPr>
-          <w:rFonts w:asciiTheme="majorBidi" w:hAnsiTheme="majorBidi" w:cstheme="majorBidi"/>
-          <w:sz w:val="24"/>
-          <w:szCs w:val="24"/>
-        </w:rPr>
-        <w:t>Originally proposed by Davis, TAM remains the most influential theory in explaining user behavior toward new software. Tetteh (2022) applied TAM to real estate software, arguing that "Perceived Usefulness" and "Perceived Ease of Use" are the two critical determinants of whether a landlord will migrate from paper ledgers to a digital system [14]. GuriGate was designed with this in mind, ensuring the dashboard is intuitive (Ease of Use) and provides clear financial summaries (Usefulness).</w:t>
-      </w:r>
-    </w:p>
-    <w:p>
-      <w:pPr>
-        <w:pStyle w:val="Heading3"/>
-        <w:bidi w:val="0"/>
-        <w:spacing w:line="360" w:lineRule="auto"/>
-        <w:rPr>
-          <w:b/>
-          <w:bCs/>
-        </w:rPr>
-      </w:pPr>
-      <w:bookmarkStart w:id="20" w:name="_Toc228527526"/>
-      <w:r>
-        <w:rPr>
-          <w:b/>
-          <w:bCs/>
+      <w:bookmarkStart w:id="27" w:name="_Toc228527533"/>
+      <w:r>
+        <w:rPr>
+          <w:b/>
+          <w:bCs/>
+        </w:rPr>
+        <w:t>3.3 System Model Design: Agile and Incremental</w:t>
+      </w:r>
+      <w:bookmarkEnd w:id="27"/>
+    </w:p>
+    <w:p>
+      <w:pPr>
+        <w:bidi w:val="0"/>
+        <w:spacing w:line="360" w:lineRule="auto"/>
+        <w:jc w:val="both"/>
+        <w:rPr>
+          <w:rFonts w:asciiTheme="majorBidi" w:hAnsiTheme="majorBidi" w:cstheme="majorBidi"/>
+          <w:sz w:val="24"/>
+          <w:szCs w:val="24"/>
+        </w:rPr>
+      </w:pPr>
+      <w:r>
+        <w:rPr>
+          <w:rFonts w:asciiTheme="majorBidi" w:hAnsiTheme="majorBidi" w:cstheme="majorBidi"/>
+          <w:sz w:val="24"/>
+          <w:szCs w:val="24"/>
+        </w:rPr>
+        <w:t>The researcher adopted an Incremental Software Development Methodology, which shares many principles with the Agile model. This choice was made because GuriGate is a complex system requiring multiple integrated modules. By breaking the project into smaller, manageable increments, the most critical functionalities</w:t>
+      </w:r>
+      <w:r>
+        <w:rPr>
+          <w:rFonts w:asciiTheme="majorBidi" w:hAnsiTheme="majorBidi" w:cstheme="majorBidi"/>
+          <w:sz w:val="24"/>
+          <w:szCs w:val="24"/>
+        </w:rPr>
+        <w:t xml:space="preserve"> </w:t>
+      </w:r>
+      <w:r>
+        <w:rPr>
+          <w:rFonts w:asciiTheme="majorBidi" w:hAnsiTheme="majorBidi" w:cstheme="majorBidi"/>
+          <w:sz w:val="24"/>
+          <w:szCs w:val="24"/>
+        </w:rPr>
+        <w:t>such as user registration and property listing</w:t>
+      </w:r>
+      <w:r>
+        <w:rPr>
+          <w:rFonts w:asciiTheme="majorBidi" w:hAnsiTheme="majorBidi" w:cstheme="majorBidi"/>
+          <w:sz w:val="24"/>
+          <w:szCs w:val="24"/>
+        </w:rPr>
+        <w:t xml:space="preserve"> </w:t>
+      </w:r>
+      <w:r>
+        <w:rPr>
+          <w:rFonts w:asciiTheme="majorBidi" w:hAnsiTheme="majorBidi" w:cstheme="majorBidi"/>
+          <w:sz w:val="24"/>
+          <w:szCs w:val="24"/>
+        </w:rPr>
+        <w:t>were developed and tested first. This allowed for early feedback and ensured that the system could adapt to changing requirements. Unlike the rigid Waterfall model, this approach facilitated an iterative cycle of design, coding, and testing, which was essential for integrating the automated components successfully.</w:t>
+      </w:r>
+    </w:p>
+    <w:p>
+      <w:pPr>
+        <w:pStyle w:val="Heading2"/>
+        <w:bidi w:val="0"/>
+        <w:spacing w:line="360" w:lineRule="auto"/>
+        <w:rPr>
+          <w:b/>
+          <w:bCs/>
+        </w:rPr>
+      </w:pPr>
+      <w:bookmarkStart w:id="28" w:name="_Toc228527534"/>
+      <w:r>
+        <w:rPr>
+          <w:b/>
+          <w:bCs/>
+        </w:rPr>
+        <w:t>3.4 Data Collection</w:t>
+      </w:r>
+      <w:bookmarkEnd w:id="28"/>
+    </w:p>
+    <w:p>
+      <w:pPr>
+        <w:bidi w:val="0"/>
+        <w:spacing w:line="360" w:lineRule="auto"/>
+        <w:jc w:val="both"/>
+        <w:rPr>
+          <w:rFonts w:asciiTheme="majorBidi" w:hAnsiTheme="majorBidi" w:cstheme="majorBidi"/>
+          <w:sz w:val="24"/>
+          <w:szCs w:val="24"/>
+        </w:rPr>
+      </w:pPr>
+      <w:r>
+        <w:rPr>
+          <w:rFonts w:asciiTheme="majorBidi" w:hAnsiTheme="majorBidi" w:cstheme="majorBidi"/>
+          <w:sz w:val="24"/>
+          <w:szCs w:val="24"/>
+        </w:rPr>
+        <w:t>To ensure the system addressed real-world problems, a multi-method data collection strategy was employed:</w:t>
+      </w:r>
+    </w:p>
+    <w:p>
+      <w:pPr>
+        <w:bidi w:val="0"/>
+        <w:spacing w:line="360" w:lineRule="auto"/>
+        <w:jc w:val="both"/>
+        <w:rPr>
+          <w:rFonts w:asciiTheme="majorBidi" w:hAnsiTheme="majorBidi" w:cstheme="majorBidi"/>
+          <w:sz w:val="24"/>
+          <w:szCs w:val="24"/>
+        </w:rPr>
+      </w:pPr>
+      <w:r>
+        <w:rPr>
+          <w:rFonts w:asciiTheme="majorBidi" w:hAnsiTheme="majorBidi" w:cstheme="majorBidi"/>
+          <w:b/>
+          <w:bCs/>
+          <w:sz w:val="24"/>
+          <w:szCs w:val="24"/>
+        </w:rPr>
+        <w:t>Structured Questionnaires:</w:t>
+      </w:r>
+      <w:r>
+        <w:rPr>
+          <w:rFonts w:asciiTheme="majorBidi" w:hAnsiTheme="majorBidi" w:cstheme="majorBidi"/>
+          <w:sz w:val="24"/>
+          <w:szCs w:val="24"/>
+        </w:rPr>
+        <w:t xml:space="preserve"> These were distributed to a sample of 250 participants to gather quantitative data on user preferences, common pain points in property searching, and the level of digital literacy.</w:t>
+      </w:r>
+    </w:p>
+    <w:p>
+      <w:pPr>
+        <w:bidi w:val="0"/>
+        <w:spacing w:line="360" w:lineRule="auto"/>
+        <w:jc w:val="both"/>
+        <w:rPr>
+          <w:rFonts w:asciiTheme="majorBidi" w:hAnsiTheme="majorBidi" w:cstheme="majorBidi"/>
+          <w:sz w:val="24"/>
+          <w:szCs w:val="24"/>
+          <w:rtl/>
+        </w:rPr>
+      </w:pPr>
+      <w:r>
+        <w:rPr>
+          <w:rFonts w:asciiTheme="majorBidi" w:hAnsiTheme="majorBidi" w:cstheme="majorBidi"/>
+          <w:b/>
+          <w:bCs/>
+          <w:sz w:val="24"/>
+          <w:szCs w:val="24"/>
+        </w:rPr>
+        <w:t>Interviews:</w:t>
+      </w:r>
+      <w:r>
+        <w:rPr>
+          <w:rFonts w:asciiTheme="majorBidi" w:hAnsiTheme="majorBidi" w:cstheme="majorBidi"/>
+          <w:sz w:val="24"/>
+          <w:szCs w:val="24"/>
+        </w:rPr>
+        <w:t xml:space="preserve"> Semi-structured oral interviews were conducted with ten professional real estate agents and five major property owners in Hargeisa. These interviews provided deep insights into the manual processes of rent collection and the prevalence of fraud.</w:t>
+      </w:r>
+    </w:p>
+    <w:p>
+      <w:pPr>
+        <w:bidi w:val="0"/>
+        <w:spacing w:line="360" w:lineRule="auto"/>
+        <w:jc w:val="both"/>
+        <w:rPr>
+          <w:rFonts w:asciiTheme="majorBidi" w:hAnsiTheme="majorBidi" w:cstheme="majorBidi"/>
+          <w:sz w:val="24"/>
+          <w:szCs w:val="24"/>
+        </w:rPr>
+      </w:pPr>
+      <w:r>
+        <w:rPr>
+          <w:rFonts w:asciiTheme="majorBidi" w:hAnsiTheme="majorBidi" w:cstheme="majorBidi"/>
+          <w:b/>
+          <w:bCs/>
+          <w:sz w:val="24"/>
+          <w:szCs w:val="24"/>
+        </w:rPr>
+        <w:t>Observation:</w:t>
+      </w:r>
+      <w:r>
+        <w:rPr>
+          <w:rFonts w:asciiTheme="majorBidi" w:hAnsiTheme="majorBidi" w:cstheme="majorBidi"/>
+          <w:sz w:val="24"/>
+          <w:szCs w:val="24"/>
+        </w:rPr>
+        <w:t xml:space="preserve"> The researcher engaged in direct observation of current market practices, including how "middlemen" advertised properties via social media and the physical process of property inspection.</w:t>
+      </w:r>
+    </w:p>
+    <w:p>
+      <w:pPr>
+        <w:pStyle w:val="Heading2"/>
+        <w:bidi w:val="0"/>
+        <w:spacing w:line="360" w:lineRule="auto"/>
+        <w:rPr>
+          <w:b/>
+          <w:bCs/>
+        </w:rPr>
+      </w:pPr>
+      <w:bookmarkStart w:id="29" w:name="_Toc228527535"/>
+      <w:r>
+        <w:rPr>
+          <w:b/>
+          <w:bCs/>
+        </w:rPr>
+        <w:t>3.5 Data Collection Source</w:t>
+      </w:r>
+      <w:bookmarkEnd w:id="29"/>
+    </w:p>
+    <w:p>
+      <w:pPr>
+        <w:bidi w:val="0"/>
+        <w:spacing w:line="360" w:lineRule="auto"/>
+        <w:jc w:val="both"/>
+        <w:rPr>
+          <w:rFonts w:asciiTheme="majorBidi" w:hAnsiTheme="majorBidi" w:cstheme="majorBidi"/>
+          <w:sz w:val="24"/>
+          <w:szCs w:val="24"/>
+        </w:rPr>
+      </w:pPr>
+      <w:r>
+        <w:rPr>
+          <w:rFonts w:asciiTheme="majorBidi" w:hAnsiTheme="majorBidi" w:cstheme="majorBidi"/>
+          <w:sz w:val="24"/>
+          <w:szCs w:val="24"/>
+        </w:rPr>
+        <w:t xml:space="preserve">Data was gathered from both primary and secondary sources. Primary data was obtained directly from the stakeholders in Hargeisa via the instruments mentioned above. Secondary data was retrieved from academic journals, past thesis projects, and official reports on the Somaliland </w:t>
+      </w:r>
+      <w:r>
+        <w:rPr>
+          <w:rFonts w:asciiTheme="majorBidi" w:hAnsiTheme="majorBidi" w:cstheme="majorBidi"/>
+          <w:sz w:val="24"/>
+          <w:szCs w:val="24"/>
         </w:rPr>
         <w:lastRenderedPageBreak/>
-        <w:t>2.4.2 Diffusion of Innovation Theory (DOI)</w:t>
-      </w:r>
-      <w:bookmarkEnd w:id="20"/>
-    </w:p>
-    <w:p>
-      <w:pPr>
-        <w:bidi w:val="0"/>
-        <w:spacing w:line="360" w:lineRule="auto"/>
-        <w:jc w:val="both"/>
-        <w:rPr>
-          <w:rFonts w:asciiTheme="majorBidi" w:hAnsiTheme="majorBidi" w:cstheme="majorBidi"/>
-          <w:sz w:val="24"/>
-          <w:szCs w:val="24"/>
-          <w:rtl/>
-        </w:rPr>
-      </w:pPr>
-      <w:r>
-        <w:rPr>
-          <w:rFonts w:asciiTheme="majorBidi" w:hAnsiTheme="majorBidi" w:cstheme="majorBidi"/>
-          <w:sz w:val="24"/>
-          <w:szCs w:val="24"/>
-        </w:rPr>
-        <w:t>Rogers' DOI theory explains how, why, and at what rate new ideas and technology spread. In the context of GuriGate, this theory helps explain the "early adopter" phase in Somaliland. According to Zhang (2025), the "Relative Advantage" of a digital system over a manual one must be immediately visible to overcome the status quo [16]. GuriGate provides this advantage through real-time notifications and algorithmic recommendations, which are innovations not currently present in the traditional Somaliland market.</w:t>
-      </w:r>
-    </w:p>
-    <w:p>
-      <w:pPr>
-        <w:pStyle w:val="Heading3"/>
-        <w:bidi w:val="0"/>
-        <w:spacing w:line="360" w:lineRule="auto"/>
-        <w:rPr>
-          <w:b/>
-          <w:bCs/>
-        </w:rPr>
-      </w:pPr>
-      <w:bookmarkStart w:id="21" w:name="_Toc228527527"/>
-      <w:r>
-        <w:rPr>
-          <w:b/>
-          <w:bCs/>
-        </w:rPr>
-        <w:t>2.4.3 Agency Theory</w:t>
-      </w:r>
-      <w:bookmarkEnd w:id="21"/>
-    </w:p>
-    <w:p>
-      <w:pPr>
-        <w:bidi w:val="0"/>
-        <w:spacing w:line="360" w:lineRule="auto"/>
-        <w:jc w:val="both"/>
-        <w:rPr>
-          <w:rFonts w:asciiTheme="majorBidi" w:hAnsiTheme="majorBidi" w:cstheme="majorBidi"/>
-          <w:sz w:val="24"/>
-          <w:szCs w:val="24"/>
-        </w:rPr>
-      </w:pPr>
-      <w:r>
-        <w:rPr>
-          <w:rFonts w:asciiTheme="majorBidi" w:hAnsiTheme="majorBidi" w:cstheme="majorBidi"/>
-          <w:sz w:val="24"/>
-          <w:szCs w:val="24"/>
-        </w:rPr>
-        <w:t>Agency Theory deals with the relationship between principals (landlords) and agents (property managers or tenants). Okafor (2024) utilized this theory to explain the "Moral Hazard" in real estate, where agents may hide information for their own benefit [11]. GuriGate acts as a "technological monitor," reducing the information gap and ensuring that the principal has direct, real-time access to payment statuses and property conditions, thereby minimizing agency costs.</w:t>
-      </w:r>
-    </w:p>
-    <w:p>
-      <w:pPr>
-        <w:pStyle w:val="Heading2"/>
-        <w:bidi w:val="0"/>
-        <w:spacing w:line="360" w:lineRule="auto"/>
-        <w:rPr>
-          <w:b/>
-          <w:bCs/>
-        </w:rPr>
-      </w:pPr>
-      <w:bookmarkStart w:id="22" w:name="_Toc228527528"/>
-      <w:r>
-        <w:rPr>
-          <w:b/>
-          <w:bCs/>
-        </w:rPr>
-        <w:t>2.5 Research Gap</w:t>
-      </w:r>
-      <w:bookmarkEnd w:id="22"/>
-    </w:p>
-    <w:p>
-      <w:pPr>
-        <w:bidi w:val="0"/>
-        <w:spacing w:line="360" w:lineRule="auto"/>
-        <w:jc w:val="both"/>
-        <w:rPr>
-          <w:rFonts w:asciiTheme="majorBidi" w:hAnsiTheme="majorBidi" w:cstheme="majorBidi"/>
-          <w:sz w:val="24"/>
-          <w:szCs w:val="24"/>
-        </w:rPr>
-      </w:pPr>
-      <w:r>
-        <w:rPr>
-          <w:rFonts w:asciiTheme="majorBidi" w:hAnsiTheme="majorBidi" w:cstheme="majorBidi"/>
-          <w:sz w:val="24"/>
-          <w:szCs w:val="24"/>
-        </w:rPr>
-        <w:t>Despite the proliferation of property systems globally, a specific gap exists in the Somaliland context. Existing literature focuses on developed markets or large African hubs like Lagos and Nairobi, often ignoring the unique socioeconomic and "middleman-heavy" structure of Hargeisa.</w:t>
-      </w:r>
-    </w:p>
-    <w:p>
-      <w:pPr>
-        <w:bidi w:val="0"/>
-        <w:spacing w:line="360" w:lineRule="auto"/>
-        <w:jc w:val="both"/>
-        <w:rPr>
-          <w:rFonts w:asciiTheme="majorBidi" w:hAnsiTheme="majorBidi" w:cstheme="majorBidi"/>
-          <w:sz w:val="24"/>
-          <w:szCs w:val="24"/>
-        </w:rPr>
-      </w:pPr>
-      <w:r>
-        <w:rPr>
-          <w:rFonts w:asciiTheme="majorBidi" w:hAnsiTheme="majorBidi" w:cstheme="majorBidi"/>
-          <w:sz w:val="24"/>
-          <w:szCs w:val="24"/>
-        </w:rPr>
-        <w:t>Identification of the Gap: There is a lack of a localized, real-time management system that integrates Algorithmic Filtering for personalized recommendations while adhering to the specific cultural and documentational requirements of Somaliland.</w:t>
-      </w:r>
-    </w:p>
-    <w:p>
-      <w:pPr>
-        <w:bidi w:val="0"/>
-        <w:spacing w:line="360" w:lineRule="auto"/>
-        <w:jc w:val="both"/>
-        <w:rPr>
-          <w:rFonts w:asciiTheme="majorBidi" w:hAnsiTheme="majorBidi" w:cstheme="majorBidi"/>
-          <w:sz w:val="24"/>
-          <w:szCs w:val="24"/>
-        </w:rPr>
-      </w:pPr>
-      <w:r>
-        <w:rPr>
-          <w:rFonts w:asciiTheme="majorBidi" w:hAnsiTheme="majorBidi" w:cstheme="majorBidi"/>
-          <w:sz w:val="24"/>
-          <w:szCs w:val="24"/>
-        </w:rPr>
-        <w:t>Consequences of the Gap: This has resulted in continued informational asymmetry, the persistence of "inspection fee" fraud, and a lack of trust among the diaspora looking to invest in local property.</w:t>
-      </w:r>
-    </w:p>
-    <w:p>
-      <w:pPr>
-        <w:bidi w:val="0"/>
-        <w:spacing w:line="360" w:lineRule="auto"/>
-        <w:jc w:val="both"/>
-        <w:rPr>
-          <w:rFonts w:asciiTheme="majorBidi" w:hAnsiTheme="majorBidi" w:cstheme="majorBidi"/>
-          <w:sz w:val="24"/>
-          <w:szCs w:val="24"/>
-        </w:rPr>
-      </w:pPr>
-      <w:r>
-        <w:rPr>
-          <w:rFonts w:asciiTheme="majorBidi" w:hAnsiTheme="majorBidi" w:cstheme="majorBidi"/>
-          <w:sz w:val="24"/>
-          <w:szCs w:val="24"/>
-        </w:rPr>
-        <w:t>Anticipated Benefits: By filling this gap, GuriGate provides a secure, transparent, and intelligent platform that empowers the user, reduces transaction costs, and professionalizes the local real estate industry.</w:t>
-      </w:r>
-    </w:p>
-    <w:p>
-      <w:pPr>
-        <w:pStyle w:val="Heading1"/>
-        <w:bidi w:val="0"/>
-        <w:spacing w:line="360" w:lineRule="auto"/>
-        <w:rPr>
-          <w:b/>
-          <w:bCs/>
-        </w:rPr>
-      </w:pPr>
-      <w:bookmarkStart w:id="23" w:name="_Toc228527529"/>
-      <w:r>
-        <w:rPr>
-          <w:b/>
-          <w:bCs/>
-        </w:rPr>
-        <w:lastRenderedPageBreak/>
-        <w:t>CHAPTER THREE: METHODOLOGY</w:t>
-      </w:r>
-      <w:bookmarkEnd w:id="23"/>
-    </w:p>
-    <w:p>
-      <w:pPr>
-        <w:pStyle w:val="Heading2"/>
-        <w:bidi w:val="0"/>
-        <w:spacing w:line="360" w:lineRule="auto"/>
-        <w:rPr>
-          <w:b/>
-          <w:bCs/>
-        </w:rPr>
-      </w:pPr>
-      <w:bookmarkStart w:id="24" w:name="_Toc228527530"/>
-      <w:r>
-        <w:rPr>
-          <w:b/>
-          <w:bCs/>
-        </w:rPr>
-        <w:t>3.0 Introduction</w:t>
-      </w:r>
-      <w:bookmarkEnd w:id="24"/>
-    </w:p>
-    <w:p>
-      <w:pPr>
-        <w:bidi w:val="0"/>
-        <w:spacing w:line="360" w:lineRule="auto"/>
-        <w:jc w:val="both"/>
-        <w:rPr>
-          <w:rFonts w:asciiTheme="majorBidi" w:hAnsiTheme="majorBidi" w:cstheme="majorBidi"/>
-          <w:sz w:val="24"/>
-          <w:szCs w:val="24"/>
-        </w:rPr>
-      </w:pPr>
-      <w:r>
-        <w:rPr>
-          <w:rFonts w:asciiTheme="majorBidi" w:hAnsiTheme="majorBidi" w:cstheme="majorBidi"/>
-          <w:sz w:val="24"/>
-          <w:szCs w:val="24"/>
-        </w:rPr>
-        <w:t>This chapter outlines the systematic approach used to develop the GuriGate property management system. It details the research design, the methods used for data collection, the technical requirements, and the various modeling diagrams that guided the system’s development. The methodology was structured to ensure that the final system was not only technically sound but also aligned with the specific socio-economic needs of the real estate market in Hargeisa, Somaliland.</w:t>
-      </w:r>
-    </w:p>
-    <w:p>
-      <w:pPr>
-        <w:pStyle w:val="Heading2"/>
-        <w:bidi w:val="0"/>
-        <w:spacing w:line="360" w:lineRule="auto"/>
-        <w:rPr>
-          <w:b/>
-          <w:bCs/>
-        </w:rPr>
-      </w:pPr>
-      <w:bookmarkStart w:id="25" w:name="_Toc228527531"/>
-      <w:r>
-        <w:rPr>
-          <w:b/>
-          <w:bCs/>
-        </w:rPr>
-        <w:t>3.1 Technology and Methods Preview</w:t>
-      </w:r>
-      <w:bookmarkEnd w:id="25"/>
-    </w:p>
-    <w:p>
-      <w:pPr>
-        <w:bidi w:val="0"/>
-        <w:spacing w:line="360" w:lineRule="auto"/>
-        <w:jc w:val="both"/>
-        <w:rPr>
-          <w:rFonts w:asciiTheme="majorBidi" w:hAnsiTheme="majorBidi" w:cstheme="majorBidi"/>
-          <w:sz w:val="24"/>
-          <w:szCs w:val="24"/>
-        </w:rPr>
-      </w:pPr>
-      <w:r>
-        <w:rPr>
-          <w:rFonts w:asciiTheme="majorBidi" w:hAnsiTheme="majorBidi" w:cstheme="majorBidi"/>
-          <w:sz w:val="24"/>
-          <w:szCs w:val="24"/>
-        </w:rPr>
-        <w:t>The development of GuriGate utilized a combination of modern web technologies and automated workflow concepts. For the front-end, ReactJS and NextJS were selected to ensure a responsive and high-performance user interface. The back-end was powered by Node.js and Supabase (PostgreSQL) served as the data management system. The methodology integrated automated property analysis through a decision-tree engine to facilitate property recommendations. The development process followed an incremental approach, allowing for continuous testing and refinement of features.</w:t>
-      </w:r>
-    </w:p>
-    <w:p>
-      <w:pPr>
-        <w:pStyle w:val="Heading2"/>
-        <w:bidi w:val="0"/>
-        <w:spacing w:line="360" w:lineRule="auto"/>
-        <w:rPr>
-          <w:b/>
-          <w:bCs/>
-        </w:rPr>
-      </w:pPr>
-      <w:bookmarkStart w:id="26" w:name="_Toc228527532"/>
-      <w:r>
-        <w:rPr>
-          <w:b/>
-          <w:bCs/>
-        </w:rPr>
-        <w:t>3.2 Research Area</w:t>
-      </w:r>
-      <w:bookmarkEnd w:id="26"/>
-    </w:p>
-    <w:p>
-      <w:pPr>
-        <w:bidi w:val="0"/>
-        <w:spacing w:line="360" w:lineRule="auto"/>
-        <w:jc w:val="both"/>
-        <w:rPr>
-          <w:rFonts w:asciiTheme="majorBidi" w:hAnsiTheme="majorBidi" w:cstheme="majorBidi"/>
-          <w:sz w:val="24"/>
-          <w:szCs w:val="24"/>
-        </w:rPr>
-      </w:pPr>
-      <w:r>
-        <w:rPr>
-          <w:rFonts w:asciiTheme="majorBidi" w:hAnsiTheme="majorBidi" w:cstheme="majorBidi"/>
-          <w:sz w:val="24"/>
-          <w:szCs w:val="24"/>
-        </w:rPr>
-        <w:t>The research area for this study was Hargeisa, Somaliland. As the fastest-growing urban center in the region, Hargeisa provided a rich environment for studying the challenges of traditional property management. The study focused on the major commercial and residential districts where real estate activity is most concentrated. This geographical focus allowed the researcher to capture the requirements of a diverse group of stakeholders, including local landlords, real estate agents, and members of the diaspora.</w:t>
-      </w:r>
-    </w:p>
-    <w:p>
-      <w:pPr>
-        <w:pStyle w:val="Heading2"/>
-        <w:bidi w:val="0"/>
-        <w:spacing w:line="360" w:lineRule="auto"/>
-        <w:rPr>
-          <w:b/>
-          <w:bCs/>
-        </w:rPr>
-      </w:pPr>
-      <w:bookmarkStart w:id="27" w:name="_Toc228527533"/>
-      <w:r>
-        <w:rPr>
-          <w:b/>
-          <w:bCs/>
-        </w:rPr>
-        <w:t>3.3 System Model Design: Agile and Incremental</w:t>
-      </w:r>
-      <w:bookmarkEnd w:id="27"/>
-    </w:p>
-    <w:p>
-      <w:pPr>
-        <w:bidi w:val="0"/>
-        <w:spacing w:line="360" w:lineRule="auto"/>
-        <w:jc w:val="both"/>
-        <w:rPr>
-          <w:rFonts w:asciiTheme="majorBidi" w:hAnsiTheme="majorBidi" w:cstheme="majorBidi"/>
-          <w:sz w:val="24"/>
-          <w:szCs w:val="24"/>
-        </w:rPr>
-      </w:pPr>
-      <w:r>
-        <w:rPr>
-          <w:rFonts w:asciiTheme="majorBidi" w:hAnsiTheme="majorBidi" w:cstheme="majorBidi"/>
-          <w:sz w:val="24"/>
-          <w:szCs w:val="24"/>
-        </w:rPr>
-        <w:t>The researcher adopted an Incremental Software Development Methodology, which shares many principles with the Agile model. This choice was made because GuriGate is a complex system requiring multiple integrated modules. By breaking the project into smaller, manageable increments, the most critical functionalities</w:t>
-      </w:r>
-      <w:r>
-        <w:rPr>
-          <w:rFonts w:asciiTheme="majorBidi" w:hAnsiTheme="majorBidi" w:cstheme="majorBidi"/>
-          <w:sz w:val="24"/>
-          <w:szCs w:val="24"/>
-        </w:rPr>
-        <w:t xml:space="preserve"> </w:t>
-      </w:r>
-      <w:r>
-        <w:rPr>
-          <w:rFonts w:asciiTheme="majorBidi" w:hAnsiTheme="majorBidi" w:cstheme="majorBidi"/>
-          <w:sz w:val="24"/>
-          <w:szCs w:val="24"/>
-        </w:rPr>
-        <w:t>such as user registration and property listing</w:t>
-      </w:r>
-      <w:r>
-        <w:rPr>
-          <w:rFonts w:asciiTheme="majorBidi" w:hAnsiTheme="majorBidi" w:cstheme="majorBidi"/>
-          <w:sz w:val="24"/>
-          <w:szCs w:val="24"/>
-        </w:rPr>
-        <w:t xml:space="preserve"> </w:t>
-      </w:r>
-      <w:r>
-        <w:rPr>
-          <w:rFonts w:asciiTheme="majorBidi" w:hAnsiTheme="majorBidi" w:cstheme="majorBidi"/>
-          <w:sz w:val="24"/>
-          <w:szCs w:val="24"/>
-        </w:rPr>
-        <w:t xml:space="preserve">were developed and tested first. This allowed for early feedback and ensured that the system could adapt to changing requirements. Unlike the rigid Waterfall model, this approach facilitated an iterative </w:t>
-      </w:r>
-      <w:r>
-        <w:rPr>
-          <w:rFonts w:asciiTheme="majorBidi" w:hAnsiTheme="majorBidi" w:cstheme="majorBidi"/>
-          <w:sz w:val="24"/>
-          <w:szCs w:val="24"/>
-        </w:rPr>
-        <w:lastRenderedPageBreak/>
-        <w:t>cycle of design, coding, and testing, which was essential for integrating the automated components successfully.</w:t>
-      </w:r>
-    </w:p>
-    <w:p>
-      <w:pPr>
-        <w:pStyle w:val="Heading2"/>
-        <w:bidi w:val="0"/>
-        <w:spacing w:line="360" w:lineRule="auto"/>
-        <w:rPr>
-          <w:b/>
-          <w:bCs/>
-        </w:rPr>
-      </w:pPr>
-      <w:bookmarkStart w:id="28" w:name="_Toc228527534"/>
-      <w:r>
-        <w:rPr>
-          <w:b/>
-          <w:bCs/>
-        </w:rPr>
-        <w:t>3.4 Data Collection</w:t>
-      </w:r>
-      <w:bookmarkEnd w:id="28"/>
-    </w:p>
-    <w:p>
-      <w:pPr>
-        <w:bidi w:val="0"/>
-        <w:spacing w:line="360" w:lineRule="auto"/>
-        <w:jc w:val="both"/>
-        <w:rPr>
-          <w:rFonts w:asciiTheme="majorBidi" w:hAnsiTheme="majorBidi" w:cstheme="majorBidi"/>
-          <w:sz w:val="24"/>
-          <w:szCs w:val="24"/>
-        </w:rPr>
-      </w:pPr>
-      <w:r>
-        <w:rPr>
-          <w:rFonts w:asciiTheme="majorBidi" w:hAnsiTheme="majorBidi" w:cstheme="majorBidi"/>
-          <w:sz w:val="24"/>
-          <w:szCs w:val="24"/>
-        </w:rPr>
-        <w:t>To ensure the system addressed real-world problems, a multi-method data collection strategy was employed:</w:t>
-      </w:r>
-    </w:p>
-    <w:p>
-      <w:pPr>
-        <w:bidi w:val="0"/>
-        <w:spacing w:line="360" w:lineRule="auto"/>
-        <w:jc w:val="both"/>
-        <w:rPr>
-          <w:rFonts w:asciiTheme="majorBidi" w:hAnsiTheme="majorBidi" w:cstheme="majorBidi"/>
-          <w:sz w:val="24"/>
-          <w:szCs w:val="24"/>
-        </w:rPr>
-      </w:pPr>
-      <w:r>
-        <w:rPr>
-          <w:rFonts w:asciiTheme="majorBidi" w:hAnsiTheme="majorBidi" w:cstheme="majorBidi"/>
-          <w:b/>
-          <w:bCs/>
-          <w:sz w:val="24"/>
-          <w:szCs w:val="24"/>
-        </w:rPr>
-        <w:t>Structured Questionnaires:</w:t>
-      </w:r>
-      <w:r>
-        <w:rPr>
-          <w:rFonts w:asciiTheme="majorBidi" w:hAnsiTheme="majorBidi" w:cstheme="majorBidi"/>
-          <w:sz w:val="24"/>
-          <w:szCs w:val="24"/>
-        </w:rPr>
-        <w:t xml:space="preserve"> These were distributed to a sample of 250 participants to gather quantitative data on user preferences, common pain points in property searching, and the level of digital literacy.</w:t>
-      </w:r>
-    </w:p>
-    <w:p>
-      <w:pPr>
-        <w:bidi w:val="0"/>
-        <w:spacing w:line="360" w:lineRule="auto"/>
-        <w:jc w:val="both"/>
-        <w:rPr>
-          <w:rFonts w:asciiTheme="majorBidi" w:hAnsiTheme="majorBidi" w:cstheme="majorBidi"/>
-          <w:sz w:val="24"/>
-          <w:szCs w:val="24"/>
-          <w:rtl/>
-        </w:rPr>
-      </w:pPr>
-      <w:r>
-        <w:rPr>
-          <w:rFonts w:asciiTheme="majorBidi" w:hAnsiTheme="majorBidi" w:cstheme="majorBidi"/>
-          <w:b/>
-          <w:bCs/>
-          <w:sz w:val="24"/>
-          <w:szCs w:val="24"/>
-        </w:rPr>
-        <w:t>Interviews:</w:t>
-      </w:r>
-      <w:r>
-        <w:rPr>
-          <w:rFonts w:asciiTheme="majorBidi" w:hAnsiTheme="majorBidi" w:cstheme="majorBidi"/>
-          <w:sz w:val="24"/>
-          <w:szCs w:val="24"/>
-        </w:rPr>
-        <w:t xml:space="preserve"> Semi-structured oral interviews were conducted with ten professional real estate agents and five major property owners in Hargeisa. These interviews provided deep insights into the manual processes of rent collection and the prevalence of fraud.</w:t>
-      </w:r>
-    </w:p>
-    <w:p>
-      <w:pPr>
-        <w:bidi w:val="0"/>
-        <w:spacing w:line="360" w:lineRule="auto"/>
-        <w:jc w:val="both"/>
-        <w:rPr>
-          <w:rFonts w:asciiTheme="majorBidi" w:hAnsiTheme="majorBidi" w:cstheme="majorBidi"/>
-          <w:sz w:val="24"/>
-          <w:szCs w:val="24"/>
-        </w:rPr>
-      </w:pPr>
-      <w:r>
-        <w:rPr>
-          <w:rFonts w:asciiTheme="majorBidi" w:hAnsiTheme="majorBidi" w:cstheme="majorBidi"/>
-          <w:b/>
-          <w:bCs/>
-          <w:sz w:val="24"/>
-          <w:szCs w:val="24"/>
-        </w:rPr>
-        <w:t>Observation:</w:t>
-      </w:r>
-      <w:r>
-        <w:rPr>
-          <w:rFonts w:asciiTheme="majorBidi" w:hAnsiTheme="majorBidi" w:cstheme="majorBidi"/>
-          <w:sz w:val="24"/>
-          <w:szCs w:val="24"/>
-        </w:rPr>
-        <w:t xml:space="preserve"> The researcher engaged in direct observation of current market practices, including how "middlemen" advertised properties via social media and the physical process of property inspection.</w:t>
-      </w:r>
-    </w:p>
-    <w:p>
-      <w:pPr>
-        <w:pStyle w:val="Heading2"/>
-        <w:bidi w:val="0"/>
-        <w:spacing w:line="360" w:lineRule="auto"/>
-        <w:rPr>
-          <w:b/>
-          <w:bCs/>
-        </w:rPr>
-      </w:pPr>
-      <w:bookmarkStart w:id="29" w:name="_Toc228527535"/>
-      <w:r>
-        <w:rPr>
-          <w:b/>
-          <w:bCs/>
-        </w:rPr>
-        <w:t>3.5 Data Collection Source</w:t>
-      </w:r>
-      <w:bookmarkEnd w:id="29"/>
-    </w:p>
-    <w:p>
-      <w:pPr>
-        <w:bidi w:val="0"/>
-        <w:spacing w:line="360" w:lineRule="auto"/>
-        <w:jc w:val="both"/>
-        <w:rPr>
-          <w:rFonts w:asciiTheme="majorBidi" w:hAnsiTheme="majorBidi" w:cstheme="majorBidi"/>
-          <w:sz w:val="24"/>
-          <w:szCs w:val="24"/>
-        </w:rPr>
-      </w:pPr>
-      <w:r>
-        <w:rPr>
-          <w:rFonts w:asciiTheme="majorBidi" w:hAnsiTheme="majorBidi" w:cstheme="majorBidi"/>
-          <w:sz w:val="24"/>
-          <w:szCs w:val="24"/>
-        </w:rPr>
-        <w:t>Data was gathered from both primary and secondary sources. Primary data was obtained directly from the stakeholders in Hargeisa via the instruments mentioned above. Secondary data was retrieved from academic journals, past thesis projects, and official reports on the Somaliland economy and urbanization trends. This dual-source approach ensured that the system was built on both current empirical evidence and established theoretical frameworks.</w:t>
+        <w:t>economy and urbanization trends. This dual-source approach ensured that the system was built on both current empirical evidence and established theoretical frameworks.</w:t>
       </w:r>
     </w:p>
     <w:p>
@@ -6658,7 +8436,6 @@
           <w:sz w:val="24"/>
           <w:szCs w:val="24"/>
         </w:rPr>
-        <w:lastRenderedPageBreak/>
         <w:t>User Registration &amp; Authentication:</w:t>
       </w:r>
       <w:r>
@@ -6981,6 +8758,7 @@
           <w:sz w:val="24"/>
           <w:szCs w:val="24"/>
         </w:rPr>
+        <w:lastRenderedPageBreak/>
         <w:t>Scalability:</w:t>
       </w:r>
       <w:r>
@@ -7254,7 +9032,6 @@
           <w:b/>
           <w:bCs/>
         </w:rPr>
-        <w:lastRenderedPageBreak/>
         <w:t>3.9.2 Software Requirements</w:t>
       </w:r>
       <w:bookmarkEnd w:id="34"/>
@@ -7613,6 +9390,7 @@
           <w:b/>
           <w:bCs/>
         </w:rPr>
+        <w:lastRenderedPageBreak/>
         <w:t>3.12 Class Diagram</w:t>
       </w:r>
       <w:bookmarkEnd w:id="37"/>
@@ -7765,7 +9543,6 @@
           <w:b/>
           <w:bCs/>
         </w:rPr>
-        <w:lastRenderedPageBreak/>
         <w:t>3.14 Analysis of the System Entity Relationship Diagram (ERD)</w:t>
       </w:r>
       <w:bookmarkEnd w:id="39"/>
@@ -8095,6 +9872,7 @@
           <w:sz w:val="24"/>
           <w:szCs w:val="24"/>
         </w:rPr>
+        <w:lastRenderedPageBreak/>
         <w:t>Informed Consent:</w:t>
       </w:r>
       <w:r>
@@ -8266,7 +10044,6 @@
           <w:sz w:val="24"/>
           <w:szCs w:val="24"/>
         </w:rPr>
-        <w:lastRenderedPageBreak/>
         <w:t>References</w:t>
       </w:r>
     </w:p>
@@ -8492,6 +10269,7 @@
           <w:sz w:val="24"/>
           <w:szCs w:val="24"/>
         </w:rPr>
+        <w:lastRenderedPageBreak/>
         <w:t>Mbata, J. (2023). PropTech trends in Kenya: From listings to blockchain. African Journal of Property Management, 11(1), pp. 30-48.</w:t>
       </w:r>
     </w:p>
@@ -8667,7 +10445,6 @@
           <w:sz w:val="24"/>
           <w:szCs w:val="24"/>
         </w:rPr>
-        <w:lastRenderedPageBreak/>
         <w:t>Zhang, Q. (2025). The Future of AI-Driven Property Management: A Five-Year Outlook. Journal of Futu</w:t>
       </w:r>
       <w:r>
@@ -8852,6 +10629,7 @@
           <w:sz w:val="24"/>
           <w:szCs w:val="24"/>
         </w:rPr>
+        <w:lastRenderedPageBreak/>
         <w:t>Ewert, M., Brodowicz, D. P., &amp; Pospieszny, P. (2018). Artificial intelligence and machines: A curse or blessing for corporate real estate? Corporate Real Estate, 7(4), 98-115.</w:t>
       </w:r>
     </w:p>
@@ -9027,7 +10805,6 @@
           <w:sz w:val="24"/>
           <w:szCs w:val="24"/>
         </w:rPr>
-        <w:lastRenderedPageBreak/>
         <w:t>Johnny, E. J. (2023). Development of Recommender System for house accommodation using content-based filtering technique.</w:t>
       </w:r>
     </w:p>
@@ -9203,6 +10980,7 @@
           <w:sz w:val="24"/>
           <w:szCs w:val="24"/>
         </w:rPr>
+        <w:lastRenderedPageBreak/>
         <w:t>Yu, T. (2020). Decision tree and boosting techniques in artificial intelligence based automated valuation models (AI-AVM). SSRN.</w:t>
       </w:r>
     </w:p>
@@ -10825,6 +12603,119 @@
       <w:pPr>
         <w:ind w:left="6120" w:hanging="180"/>
       </w:pPr>
+    </w:lvl>
+  </w:abstractNum>
+  <w:abstractNum w:abstractNumId="15" w15:restartNumberingAfterBreak="0">
+    <w:nsid w:val="7D991D03"/>
+    <w:multiLevelType w:val="hybridMultilevel"/>
+    <w:tmpl w:val="74CE96C8"/>
+    <w:lvl w:ilvl="0" w:tplc="04090001">
+      <w:start w:val="1"/>
+      <w:numFmt w:val="bullet"/>
+      <w:lvlText w:val=""/>
+      <w:lvlJc w:val="left"/>
+      <w:pPr>
+        <w:ind w:left="720" w:hanging="360"/>
+      </w:pPr>
+      <w:rPr>
+        <w:rFonts w:ascii="Symbol" w:hAnsi="Symbol" w:hint="default"/>
+      </w:rPr>
+    </w:lvl>
+    <w:lvl w:ilvl="1" w:tplc="04090003" w:tentative="1">
+      <w:start w:val="1"/>
+      <w:numFmt w:val="bullet"/>
+      <w:lvlText w:val="o"/>
+      <w:lvlJc w:val="left"/>
+      <w:pPr>
+        <w:ind w:left="1440" w:hanging="360"/>
+      </w:pPr>
+      <w:rPr>
+        <w:rFonts w:ascii="Courier New" w:hAnsi="Courier New" w:cs="Courier New" w:hint="default"/>
+      </w:rPr>
+    </w:lvl>
+    <w:lvl w:ilvl="2" w:tplc="04090005" w:tentative="1">
+      <w:start w:val="1"/>
+      <w:numFmt w:val="bullet"/>
+      <w:lvlText w:val=""/>
+      <w:lvlJc w:val="left"/>
+      <w:pPr>
+        <w:ind w:left="2160" w:hanging="360"/>
+      </w:pPr>
+      <w:rPr>
+        <w:rFonts w:ascii="Wingdings" w:hAnsi="Wingdings" w:hint="default"/>
+      </w:rPr>
+    </w:lvl>
+    <w:lvl w:ilvl="3" w:tplc="04090001" w:tentative="1">
+      <w:start w:val="1"/>
+      <w:numFmt w:val="bullet"/>
+      <w:lvlText w:val=""/>
+      <w:lvlJc w:val="left"/>
+      <w:pPr>
+        <w:ind w:left="2880" w:hanging="360"/>
+      </w:pPr>
+      <w:rPr>
+        <w:rFonts w:ascii="Symbol" w:hAnsi="Symbol" w:hint="default"/>
+      </w:rPr>
+    </w:lvl>
+    <w:lvl w:ilvl="4" w:tplc="04090003" w:tentative="1">
+      <w:start w:val="1"/>
+      <w:numFmt w:val="bullet"/>
+      <w:lvlText w:val="o"/>
+      <w:lvlJc w:val="left"/>
+      <w:pPr>
+        <w:ind w:left="3600" w:hanging="360"/>
+      </w:pPr>
+      <w:rPr>
+        <w:rFonts w:ascii="Courier New" w:hAnsi="Courier New" w:cs="Courier New" w:hint="default"/>
+      </w:rPr>
+    </w:lvl>
+    <w:lvl w:ilvl="5" w:tplc="04090005" w:tentative="1">
+      <w:start w:val="1"/>
+      <w:numFmt w:val="bullet"/>
+      <w:lvlText w:val=""/>
+      <w:lvlJc w:val="left"/>
+      <w:pPr>
+        <w:ind w:left="4320" w:hanging="360"/>
+      </w:pPr>
+      <w:rPr>
+        <w:rFonts w:ascii="Wingdings" w:hAnsi="Wingdings" w:hint="default"/>
+      </w:rPr>
+    </w:lvl>
+    <w:lvl w:ilvl="6" w:tplc="04090001" w:tentative="1">
+      <w:start w:val="1"/>
+      <w:numFmt w:val="bullet"/>
+      <w:lvlText w:val=""/>
+      <w:lvlJc w:val="left"/>
+      <w:pPr>
+        <w:ind w:left="5040" w:hanging="360"/>
+      </w:pPr>
+      <w:rPr>
+        <w:rFonts w:ascii="Symbol" w:hAnsi="Symbol" w:hint="default"/>
+      </w:rPr>
+    </w:lvl>
+    <w:lvl w:ilvl="7" w:tplc="04090003" w:tentative="1">
+      <w:start w:val="1"/>
+      <w:numFmt w:val="bullet"/>
+      <w:lvlText w:val="o"/>
+      <w:lvlJc w:val="left"/>
+      <w:pPr>
+        <w:ind w:left="5760" w:hanging="360"/>
+      </w:pPr>
+      <w:rPr>
+        <w:rFonts w:ascii="Courier New" w:hAnsi="Courier New" w:cs="Courier New" w:hint="default"/>
+      </w:rPr>
+    </w:lvl>
+    <w:lvl w:ilvl="8" w:tplc="04090005" w:tentative="1">
+      <w:start w:val="1"/>
+      <w:numFmt w:val="bullet"/>
+      <w:lvlText w:val=""/>
+      <w:lvlJc w:val="left"/>
+      <w:pPr>
+        <w:ind w:left="6480" w:hanging="360"/>
+      </w:pPr>
+      <w:rPr>
+        <w:rFonts w:ascii="Wingdings" w:hAnsi="Wingdings" w:hint="default"/>
+      </w:rPr>
     </w:lvl>
   </w:abstractNum>
   <w:num w:numId="1" w16cid:durableId="1336036645">
@@ -10871,6 +12762,9 @@
   </w:num>
   <w:num w:numId="15" w16cid:durableId="1366517277">
     <w:abstractNumId w:val="5"/>
+  </w:num>
+  <w:num w:numId="16" w16cid:durableId="519855516">
+    <w:abstractNumId w:val="15"/>
   </w:num>
 </w:numbering>
 </file>
@@ -11343,7 +13237,6 @@
   <w:style w:type="character" w:default="1" w:styleId="DefaultParagraphFont">
     <w:name w:val="Default Paragraph Font"/>
     <w:uiPriority w:val="1"/>
-    <w:semiHidden/>
     <w:unhideWhenUsed/>
   </w:style>
   <w:style w:type="table" w:default="1" w:styleId="TableNormal">

</xml_diff>